<commit_message>
big little indian bug deleted
</commit_message>
<xml_diff>
--- a/MyTracert/LR2_jalilova.docx
+++ b/MyTracert/LR2_jalilova.docx
@@ -382,7 +382,6 @@
         </w:rPr>
         <w:t>T</w:t>
       </w:r>
-      <w:proofErr w:type="spellStart"/>
       <w:r>
         <w:rPr>
           <w:rFonts w:ascii="Times New Roman" w:hAnsi="Times New Roman" w:cs="Times New Roman"/>
@@ -391,7 +390,6 @@
         </w:rPr>
         <w:t>racerout</w:t>
       </w:r>
-      <w:proofErr w:type="spellEnd"/>
       <w:r>
         <w:rPr>
           <w:rFonts w:ascii="Times New Roman" w:hAnsi="Times New Roman" w:cs="Times New Roman"/>
@@ -641,18 +639,8 @@
                 <w:sz w:val="28"/>
                 <w:szCs w:val="28"/>
               </w:rPr>
-              <w:t xml:space="preserve">С.В. </w:t>
+              <w:t>С.В. Болтак</w:t>
             </w:r>
-            <w:proofErr w:type="spellStart"/>
-            <w:r>
-              <w:rPr>
-                <w:rFonts w:ascii="Times New Roman" w:hAnsi="Times New Roman" w:cs="Times New Roman"/>
-                <w:sz w:val="28"/>
-                <w:szCs w:val="28"/>
-              </w:rPr>
-              <w:t>Болтак</w:t>
-            </w:r>
-            <w:proofErr w:type="spellEnd"/>
           </w:p>
         </w:tc>
       </w:tr>
@@ -825,10 +813,12 @@
           <w:szCs w:val="28"/>
           <w:lang w:eastAsia="ru-RU"/>
         </w:rPr>
-        <w:t xml:space="preserve">разработать простейший аналог утилиты </w:t>
-      </w:r>
-      <w:proofErr w:type="spellStart"/>
-      <w:r>
+        <w:t>разработать простейший аналог утилиты traceroute / tracert, изученной в рамках первой лабораторной работы.</w:t>
+      </w:r>
+    </w:p>
+    <w:p>
+      <w:pPr>
+        <w:spacing w:after="0"/>
         <w:rPr>
           <w:rFonts w:ascii="Times New Roman" w:eastAsia="Times New Roman" w:hAnsi="Times New Roman" w:cs="Times New Roman"/>
           <w:color w:val="000000"/>
@@ -836,52 +826,6 @@
           <w:szCs w:val="28"/>
           <w:lang w:eastAsia="ru-RU"/>
         </w:rPr>
-        <w:t>traceroute</w:t>
-      </w:r>
-      <w:proofErr w:type="spellEnd"/>
-      <w:r>
-        <w:rPr>
-          <w:rFonts w:ascii="Times New Roman" w:eastAsia="Times New Roman" w:hAnsi="Times New Roman" w:cs="Times New Roman"/>
-          <w:color w:val="000000"/>
-          <w:sz w:val="28"/>
-          <w:szCs w:val="28"/>
-          <w:lang w:eastAsia="ru-RU"/>
-        </w:rPr>
-        <w:t xml:space="preserve"> / </w:t>
-      </w:r>
-      <w:proofErr w:type="spellStart"/>
-      <w:r>
-        <w:rPr>
-          <w:rFonts w:ascii="Times New Roman" w:eastAsia="Times New Roman" w:hAnsi="Times New Roman" w:cs="Times New Roman"/>
-          <w:color w:val="000000"/>
-          <w:sz w:val="28"/>
-          <w:szCs w:val="28"/>
-          <w:lang w:eastAsia="ru-RU"/>
-        </w:rPr>
-        <w:t>tracert</w:t>
-      </w:r>
-      <w:proofErr w:type="spellEnd"/>
-      <w:r>
-        <w:rPr>
-          <w:rFonts w:ascii="Times New Roman" w:eastAsia="Times New Roman" w:hAnsi="Times New Roman" w:cs="Times New Roman"/>
-          <w:color w:val="000000"/>
-          <w:sz w:val="28"/>
-          <w:szCs w:val="28"/>
-          <w:lang w:eastAsia="ru-RU"/>
-        </w:rPr>
-        <w:t>, изученной в рамках первой лабораторной работы.</w:t>
-      </w:r>
-    </w:p>
-    <w:p>
-      <w:pPr>
-        <w:spacing w:after="0"/>
-        <w:rPr>
-          <w:rFonts w:ascii="Times New Roman" w:eastAsia="Times New Roman" w:hAnsi="Times New Roman" w:cs="Times New Roman"/>
-          <w:color w:val="000000"/>
-          <w:sz w:val="28"/>
-          <w:szCs w:val="28"/>
-          <w:lang w:eastAsia="ru-RU"/>
-        </w:rPr>
       </w:pPr>
     </w:p>
     <w:p>
@@ -937,43 +881,7 @@
           <w:sz w:val="28"/>
           <w:szCs w:val="28"/>
         </w:rPr>
-        <w:t xml:space="preserve"> должна принимать в качестве параметра IP-адрес целевого узла и выводить узлы маршрута аналогично системному </w:t>
-      </w:r>
-      <w:proofErr w:type="spellStart"/>
-      <w:r>
-        <w:rPr>
-          <w:rFonts w:ascii="Times New Roman" w:hAnsi="Times New Roman" w:cs="Times New Roman"/>
-          <w:sz w:val="28"/>
-          <w:szCs w:val="28"/>
-        </w:rPr>
-        <w:t>traceroute</w:t>
-      </w:r>
-      <w:proofErr w:type="spellEnd"/>
-      <w:r>
-        <w:rPr>
-          <w:rFonts w:ascii="Times New Roman" w:hAnsi="Times New Roman" w:cs="Times New Roman"/>
-          <w:sz w:val="28"/>
-          <w:szCs w:val="28"/>
-        </w:rPr>
-        <w:t xml:space="preserve"> / </w:t>
-      </w:r>
-      <w:proofErr w:type="spellStart"/>
-      <w:r>
-        <w:rPr>
-          <w:rFonts w:ascii="Times New Roman" w:hAnsi="Times New Roman" w:cs="Times New Roman"/>
-          <w:sz w:val="28"/>
-          <w:szCs w:val="28"/>
-        </w:rPr>
-        <w:t>tracert</w:t>
-      </w:r>
-      <w:proofErr w:type="spellEnd"/>
-      <w:r>
-        <w:rPr>
-          <w:rFonts w:ascii="Times New Roman" w:hAnsi="Times New Roman" w:cs="Times New Roman"/>
-          <w:sz w:val="28"/>
-          <w:szCs w:val="28"/>
-        </w:rPr>
-        <w:t xml:space="preserve"> (порядковый номер, время ожидания ответа для каждого отправленного пакета и адрес узла). Следует отправлять более одного пакета.</w:t>
+        <w:t xml:space="preserve"> должна принимать в качестве параметра IP-адрес целевого узла и выводить узлы маршрута аналогично системному traceroute / tracert (порядковый номер, время ожидания ответа для каждого отправленного пакета и адрес узла). Следует отправлять более одного пакета.</w:t>
       </w:r>
       <w:r>
         <w:rPr>
@@ -1051,43 +959,7 @@
           <w:sz w:val="28"/>
           <w:szCs w:val="28"/>
         </w:rPr>
-        <w:t xml:space="preserve">обавить параметр командной строки, активирующий режим разрешения в имена узлов через обратные DNS-запросы. В этом режиме помимо IP-адресов узлов маршрута должны выводиться и их имена (такое поведение является поведением по умолчанию для системных </w:t>
-      </w:r>
-      <w:proofErr w:type="spellStart"/>
-      <w:r>
-        <w:rPr>
-          <w:rFonts w:ascii="Times New Roman" w:hAnsi="Times New Roman" w:cs="Times New Roman"/>
-          <w:sz w:val="28"/>
-          <w:szCs w:val="28"/>
-        </w:rPr>
-        <w:t>tracert</w:t>
-      </w:r>
-      <w:proofErr w:type="spellEnd"/>
-      <w:r>
-        <w:rPr>
-          <w:rFonts w:ascii="Times New Roman" w:hAnsi="Times New Roman" w:cs="Times New Roman"/>
-          <w:sz w:val="28"/>
-          <w:szCs w:val="28"/>
-        </w:rPr>
-        <w:t xml:space="preserve"> / </w:t>
-      </w:r>
-      <w:proofErr w:type="spellStart"/>
-      <w:r>
-        <w:rPr>
-          <w:rFonts w:ascii="Times New Roman" w:hAnsi="Times New Roman" w:cs="Times New Roman"/>
-          <w:sz w:val="28"/>
-          <w:szCs w:val="28"/>
-        </w:rPr>
-        <w:t>traceroute</w:t>
-      </w:r>
-      <w:proofErr w:type="spellEnd"/>
-      <w:r>
-        <w:rPr>
-          <w:rFonts w:ascii="Times New Roman" w:hAnsi="Times New Roman" w:cs="Times New Roman"/>
-          <w:sz w:val="28"/>
-          <w:szCs w:val="28"/>
-        </w:rPr>
-        <w:t xml:space="preserve">); </w:t>
+        <w:t xml:space="preserve">обавить параметр командной строки, активирующий режим разрешения в имена узлов через обратные DNS-запросы. В этом режиме помимо IP-адресов узлов маршрута должны выводиться и их имена (такое поведение является поведением по умолчанию для системных tracert / traceroute); </w:t>
       </w:r>
       <w:r>
         <w:rPr>
@@ -1103,25 +975,7 @@
           <w:sz w:val="28"/>
           <w:szCs w:val="28"/>
         </w:rPr>
-        <w:t xml:space="preserve">обавить возможность задавать имя целевого узла вместо его IP-адреса: </w:t>
-      </w:r>
-      <w:proofErr w:type="spellStart"/>
-      <w:r>
-        <w:rPr>
-          <w:rFonts w:ascii="Times New Roman" w:hAnsi="Times New Roman" w:cs="Times New Roman"/>
-          <w:sz w:val="28"/>
-          <w:szCs w:val="28"/>
-        </w:rPr>
-        <w:t>mytraceroute</w:t>
-      </w:r>
-      <w:proofErr w:type="spellEnd"/>
-      <w:r>
-        <w:rPr>
-          <w:rFonts w:ascii="Times New Roman" w:hAnsi="Times New Roman" w:cs="Times New Roman"/>
-          <w:sz w:val="28"/>
-          <w:szCs w:val="28"/>
-        </w:rPr>
-        <w:t xml:space="preserve"> google.com.</w:t>
+        <w:t>обавить возможность задавать имя целевого узла вместо его IP-адреса: mytraceroute google.com.</w:t>
       </w:r>
     </w:p>
     <w:p>
@@ -1197,10 +1051,10 @@
           <w:szCs w:val="28"/>
         </w:rPr>
         <w:drawing>
-          <wp:inline distT="0" distB="0" distL="0" distR="0" wp14:anchorId="1ECF50F2" wp14:editId="7C7E830A">
-            <wp:extent cx="3954145" cy="2783205"/>
-            <wp:effectExtent l="0" t="0" r="8255" b="0"/>
-            <wp:docPr id="29" name="Рисунок 29"/>
+          <wp:inline distT="0" distB="0" distL="0" distR="0" wp14:anchorId="1D325705" wp14:editId="4820D0AC">
+            <wp:extent cx="3855720" cy="3154680"/>
+            <wp:effectExtent l="0" t="0" r="0" b="7620"/>
+            <wp:docPr id="8" name="Рисунок 8"/>
             <wp:cNvGraphicFramePr>
               <a:graphicFrameLocks xmlns:a="http://schemas.openxmlformats.org/drawingml/2006/main" noChangeAspect="1"/>
             </wp:cNvGraphicFramePr>
@@ -1208,7 +1062,7 @@
               <a:graphicData uri="http://schemas.openxmlformats.org/drawingml/2006/picture">
                 <pic:pic xmlns:pic="http://schemas.openxmlformats.org/drawingml/2006/picture">
                   <pic:nvPicPr>
-                    <pic:cNvPr id="0" name="Picture 21"/>
+                    <pic:cNvPr id="0" name="Picture 5"/>
                     <pic:cNvPicPr>
                       <a:picLocks noChangeAspect="1" noChangeArrowheads="1"/>
                     </pic:cNvPicPr>
@@ -1229,7 +1083,7 @@
                   <pic:spPr bwMode="auto">
                     <a:xfrm>
                       <a:off x="0" y="0"/>
-                      <a:ext cx="3954145" cy="2783205"/>
+                      <a:ext cx="3855720" cy="3154680"/>
                     </a:xfrm>
                     <a:prstGeom prst="rect">
                       <a:avLst/>
@@ -1335,6 +1189,17 @@
         <w:spacing w:after="0"/>
         <w:rPr>
           <w:rFonts w:ascii="Times New Roman" w:hAnsi="Times New Roman" w:cs="Times New Roman"/>
+          <w:noProof/>
+          <w:sz w:val="28"/>
+          <w:szCs w:val="28"/>
+        </w:rPr>
+      </w:pPr>
+    </w:p>
+    <w:p>
+      <w:pPr>
+        <w:spacing w:after="0"/>
+        <w:rPr>
+          <w:rFonts w:ascii="Times New Roman" w:hAnsi="Times New Roman" w:cs="Times New Roman"/>
           <w:sz w:val="28"/>
           <w:szCs w:val="28"/>
         </w:rPr>
@@ -1348,10 +1213,10 @@
         </w:rPr>
         <w:lastRenderedPageBreak/>
         <w:drawing>
-          <wp:inline distT="0" distB="0" distL="0" distR="0" wp14:anchorId="146ACFD1" wp14:editId="4C56183B">
-            <wp:extent cx="5326380" cy="3741420"/>
-            <wp:effectExtent l="0" t="0" r="7620" b="0"/>
-            <wp:docPr id="3" name="Рисунок 3"/>
+          <wp:inline distT="0" distB="0" distL="0" distR="0" wp14:anchorId="09341E68" wp14:editId="6F1965D9">
+            <wp:extent cx="5334000" cy="3208020"/>
+            <wp:effectExtent l="0" t="0" r="0" b="0"/>
+            <wp:docPr id="18" name="Рисунок 18"/>
             <wp:cNvGraphicFramePr>
               <a:graphicFrameLocks xmlns:a="http://schemas.openxmlformats.org/drawingml/2006/main" noChangeAspect="1"/>
             </wp:cNvGraphicFramePr>
@@ -1359,12 +1224,12 @@
               <a:graphicData uri="http://schemas.openxmlformats.org/drawingml/2006/picture">
                 <pic:pic xmlns:pic="http://schemas.openxmlformats.org/drawingml/2006/picture">
                   <pic:nvPicPr>
-                    <pic:cNvPr id="0" name="Picture 3"/>
+                    <pic:cNvPr id="0" name="Picture 12"/>
                     <pic:cNvPicPr>
                       <a:picLocks noChangeAspect="1" noChangeArrowheads="1"/>
                     </pic:cNvPicPr>
                   </pic:nvPicPr>
-                  <pic:blipFill>
+                  <pic:blipFill rotWithShape="1">
                     <a:blip r:embed="rId9">
                       <a:extLst>
                         <a:ext uri="{28A0092B-C50C-407E-A947-70E740481C1C}">
@@ -1372,134 +1237,13 @@
                         </a:ext>
                       </a:extLst>
                     </a:blip>
-                    <a:srcRect/>
-                    <a:stretch>
-                      <a:fillRect/>
-                    </a:stretch>
-                  </pic:blipFill>
-                  <pic:spPr bwMode="auto">
-                    <a:xfrm>
-                      <a:off x="0" y="0"/>
-                      <a:ext cx="5326380" cy="3741420"/>
-                    </a:xfrm>
-                    <a:prstGeom prst="rect">
-                      <a:avLst/>
-                    </a:prstGeom>
-                    <a:noFill/>
-                    <a:ln>
-                      <a:noFill/>
-                    </a:ln>
-                  </pic:spPr>
-                </pic:pic>
-              </a:graphicData>
-            </a:graphic>
-          </wp:inline>
-        </w:drawing>
-      </w:r>
-    </w:p>
-    <w:p>
-      <w:pPr>
-        <w:spacing w:after="0"/>
-        <w:jc w:val="center"/>
-        <w:rPr>
-          <w:rFonts w:ascii="Times New Roman" w:hAnsi="Times New Roman" w:cs="Times New Roman"/>
-          <w:sz w:val="28"/>
-          <w:szCs w:val="28"/>
-        </w:rPr>
-      </w:pPr>
-    </w:p>
-    <w:p>
-      <w:pPr>
-        <w:spacing w:after="0"/>
-        <w:jc w:val="center"/>
-        <w:rPr>
-          <w:rFonts w:ascii="Times New Roman" w:hAnsi="Times New Roman" w:cs="Times New Roman"/>
-          <w:sz w:val="28"/>
-          <w:szCs w:val="28"/>
-        </w:rPr>
-      </w:pPr>
-      <w:r>
-        <w:rPr>
-          <w:rFonts w:ascii="Times New Roman" w:hAnsi="Times New Roman" w:cs="Times New Roman"/>
-          <w:sz w:val="28"/>
-          <w:szCs w:val="28"/>
-        </w:rPr>
-        <w:t>Рисунок 2 – Работа системной утилиты</w:t>
-      </w:r>
-    </w:p>
-    <w:p>
-      <w:pPr>
-        <w:spacing w:after="0"/>
-        <w:jc w:val="center"/>
-        <w:rPr>
-          <w:rFonts w:ascii="Times New Roman" w:hAnsi="Times New Roman" w:cs="Times New Roman"/>
-          <w:sz w:val="28"/>
-          <w:szCs w:val="28"/>
-        </w:rPr>
-      </w:pPr>
-    </w:p>
-    <w:p>
-      <w:pPr>
-        <w:spacing w:after="0"/>
-        <w:jc w:val="center"/>
-        <w:rPr>
-          <w:rFonts w:ascii="Times New Roman" w:hAnsi="Times New Roman" w:cs="Times New Roman"/>
-          <w:noProof/>
-          <w:sz w:val="28"/>
-          <w:szCs w:val="28"/>
-        </w:rPr>
-      </w:pPr>
-    </w:p>
-    <w:p>
-      <w:pPr>
-        <w:spacing w:after="0"/>
-        <w:jc w:val="center"/>
-        <w:rPr>
-          <w:rFonts w:ascii="Times New Roman" w:hAnsi="Times New Roman" w:cs="Times New Roman"/>
-          <w:noProof/>
-          <w:sz w:val="28"/>
-          <w:szCs w:val="28"/>
-        </w:rPr>
-      </w:pPr>
-      <w:r>
-        <w:rPr>
-          <w:rFonts w:ascii="Times New Roman" w:hAnsi="Times New Roman" w:cs="Times New Roman"/>
-          <w:noProof/>
-          <w:sz w:val="28"/>
-          <w:szCs w:val="28"/>
-        </w:rPr>
-        <w:drawing>
-          <wp:inline distT="0" distB="0" distL="0" distR="0" wp14:anchorId="617FB2EF" wp14:editId="0FA10016">
-            <wp:extent cx="6261484" cy="1435769"/>
-            <wp:effectExtent l="0" t="0" r="6350" b="0"/>
-            <wp:docPr id="21" name="Рисунок 21"/>
-            <wp:cNvGraphicFramePr>
-              <a:graphicFrameLocks xmlns:a="http://schemas.openxmlformats.org/drawingml/2006/main" noChangeAspect="1"/>
-            </wp:cNvGraphicFramePr>
-            <a:graphic xmlns:a="http://schemas.openxmlformats.org/drawingml/2006/main">
-              <a:graphicData uri="http://schemas.openxmlformats.org/drawingml/2006/picture">
-                <pic:pic xmlns:pic="http://schemas.openxmlformats.org/drawingml/2006/picture">
-                  <pic:nvPicPr>
-                    <pic:cNvPr id="0" name="Picture 13"/>
-                    <pic:cNvPicPr>
-                      <a:picLocks noChangeAspect="1" noChangeArrowheads="1"/>
-                    </pic:cNvPicPr>
-                  </pic:nvPicPr>
-                  <pic:blipFill rotWithShape="1">
-                    <a:blip r:embed="rId10">
-                      <a:extLst>
-                        <a:ext uri="{28A0092B-C50C-407E-A947-70E740481C1C}">
-                          <a14:useLocalDpi xmlns:a14="http://schemas.microsoft.com/office/drawing/2010/main" val="0"/>
-                        </a:ext>
-                      </a:extLst>
-                    </a:blip>
-                    <a:srcRect l="16498" t="1021" r="1329" b="17007"/>
+                    <a:srcRect l="2098"/>
                     <a:stretch/>
                   </pic:blipFill>
                   <pic:spPr bwMode="auto">
                     <a:xfrm>
                       <a:off x="0" y="0"/>
-                      <a:ext cx="6278042" cy="1439566"/>
+                      <a:ext cx="5334000" cy="3208020"/>
                     </a:xfrm>
                     <a:prstGeom prst="rect">
                       <a:avLst/>
@@ -1548,60 +1292,39 @@
           <w:sz w:val="28"/>
           <w:szCs w:val="28"/>
         </w:rPr>
-        <w:t xml:space="preserve">Рисунок 3 – Трафик, генерируемый разработанной утилитой в </w:t>
-      </w:r>
-      <w:r>
-        <w:rPr>
-          <w:rFonts w:ascii="Times New Roman" w:hAnsi="Times New Roman" w:cs="Times New Roman"/>
-          <w:sz w:val="28"/>
-          <w:szCs w:val="28"/>
-          <w:lang w:val="en-US"/>
-        </w:rPr>
-        <w:t>Wireshark</w:t>
-      </w:r>
-    </w:p>
-    <w:p>
-      <w:pPr>
-        <w:spacing w:after="0"/>
-        <w:jc w:val="center"/>
-        <w:rPr>
-          <w:rFonts w:ascii="Times New Roman" w:hAnsi="Times New Roman" w:cs="Times New Roman"/>
-          <w:noProof/>
-          <w:sz w:val="28"/>
-          <w:szCs w:val="28"/>
-        </w:rPr>
-      </w:pPr>
-    </w:p>
-    <w:p>
-      <w:pPr>
-        <w:spacing w:after="0"/>
-        <w:jc w:val="center"/>
-        <w:rPr>
-          <w:rFonts w:ascii="Times New Roman" w:hAnsi="Times New Roman" w:cs="Times New Roman"/>
-          <w:noProof/>
-          <w:sz w:val="28"/>
-          <w:szCs w:val="28"/>
-        </w:rPr>
-      </w:pPr>
-    </w:p>
-    <w:p>
-      <w:pPr>
-        <w:spacing w:after="0"/>
-        <w:jc w:val="center"/>
-        <w:rPr>
-          <w:rFonts w:ascii="Times New Roman" w:hAnsi="Times New Roman" w:cs="Times New Roman"/>
-          <w:noProof/>
-          <w:sz w:val="28"/>
-          <w:szCs w:val="28"/>
-        </w:rPr>
-      </w:pPr>
-    </w:p>
-    <w:p>
-      <w:pPr>
-        <w:spacing w:after="0"/>
-        <w:jc w:val="center"/>
-        <w:rPr>
-          <w:rFonts w:ascii="Times New Roman" w:hAnsi="Times New Roman" w:cs="Times New Roman"/>
+        <w:t>Рисунок 2 – Работа системной утилиты</w:t>
+      </w:r>
+    </w:p>
+    <w:p>
+      <w:pPr>
+        <w:spacing w:after="0"/>
+        <w:jc w:val="center"/>
+        <w:rPr>
+          <w:rFonts w:ascii="Times New Roman" w:hAnsi="Times New Roman" w:cs="Times New Roman"/>
+          <w:sz w:val="28"/>
+          <w:szCs w:val="28"/>
+        </w:rPr>
+      </w:pPr>
+    </w:p>
+    <w:p>
+      <w:pPr>
+        <w:spacing w:after="0"/>
+        <w:jc w:val="center"/>
+        <w:rPr>
+          <w:rFonts w:ascii="Times New Roman" w:hAnsi="Times New Roman" w:cs="Times New Roman"/>
+          <w:noProof/>
+          <w:sz w:val="28"/>
+          <w:szCs w:val="28"/>
+        </w:rPr>
+      </w:pPr>
+    </w:p>
+    <w:p>
+      <w:pPr>
+        <w:spacing w:after="0"/>
+        <w:jc w:val="center"/>
+        <w:rPr>
+          <w:rFonts w:ascii="Times New Roman" w:hAnsi="Times New Roman" w:cs="Times New Roman"/>
+          <w:noProof/>
           <w:sz w:val="28"/>
           <w:szCs w:val="28"/>
         </w:rPr>
@@ -1614,10 +1337,10 @@
           <w:szCs w:val="28"/>
         </w:rPr>
         <w:drawing>
-          <wp:inline distT="0" distB="0" distL="0" distR="0" wp14:anchorId="3B1E9350" wp14:editId="16C582BD">
-            <wp:extent cx="6370018" cy="1106905"/>
-            <wp:effectExtent l="0" t="0" r="0" b="0"/>
-            <wp:docPr id="12" name="Рисунок 12"/>
+          <wp:inline distT="0" distB="0" distL="0" distR="0" wp14:anchorId="5F9774F5" wp14:editId="1B3F874E">
+            <wp:extent cx="6306979" cy="1554480"/>
+            <wp:effectExtent l="0" t="0" r="0" b="7620"/>
+            <wp:docPr id="11" name="Рисунок 11"/>
             <wp:cNvGraphicFramePr>
               <a:graphicFrameLocks xmlns:a="http://schemas.openxmlformats.org/drawingml/2006/main" noChangeAspect="1"/>
             </wp:cNvGraphicFramePr>
@@ -1625,26 +1348,28 @@
               <a:graphicData uri="http://schemas.openxmlformats.org/drawingml/2006/picture">
                 <pic:pic xmlns:pic="http://schemas.openxmlformats.org/drawingml/2006/picture">
                   <pic:nvPicPr>
-                    <pic:cNvPr id="0" name="Picture 9"/>
+                    <pic:cNvPr id="0" name="Picture 6"/>
                     <pic:cNvPicPr>
                       <a:picLocks noChangeAspect="1" noChangeArrowheads="1"/>
                     </pic:cNvPicPr>
                   </pic:nvPicPr>
-                  <pic:blipFill rotWithShape="1">
-                    <a:blip r:embed="rId11">
+                  <pic:blipFill>
+                    <a:blip r:embed="rId10">
                       <a:extLst>
                         <a:ext uri="{28A0092B-C50C-407E-A947-70E740481C1C}">
                           <a14:useLocalDpi xmlns:a14="http://schemas.microsoft.com/office/drawing/2010/main" val="0"/>
                         </a:ext>
                       </a:extLst>
                     </a:blip>
-                    <a:srcRect l="16763" t="6500" r="4218" b="43918"/>
-                    <a:stretch/>
+                    <a:srcRect/>
+                    <a:stretch>
+                      <a:fillRect/>
+                    </a:stretch>
                   </pic:blipFill>
                   <pic:spPr bwMode="auto">
                     <a:xfrm>
                       <a:off x="0" y="0"/>
-                      <a:ext cx="6422645" cy="1116050"/>
+                      <a:ext cx="6312051" cy="1555730"/>
                     </a:xfrm>
                     <a:prstGeom prst="rect">
                       <a:avLst/>
@@ -1653,11 +1378,6 @@
                     <a:ln>
                       <a:noFill/>
                     </a:ln>
-                    <a:extLst>
-                      <a:ext uri="{53640926-AAD7-44D8-BBD7-CCE9431645EC}">
-                        <a14:shadowObscured xmlns:a14="http://schemas.microsoft.com/office/drawing/2010/main"/>
-                      </a:ext>
-                    </a:extLst>
                   </pic:spPr>
                 </pic:pic>
               </a:graphicData>
@@ -1693,47 +1413,7 @@
           <w:sz w:val="28"/>
           <w:szCs w:val="28"/>
         </w:rPr>
-        <w:t xml:space="preserve">Рисунок </w:t>
-      </w:r>
-      <w:r>
-        <w:rPr>
-          <w:rFonts w:ascii="Times New Roman" w:hAnsi="Times New Roman" w:cs="Times New Roman"/>
-          <w:sz w:val="28"/>
-          <w:szCs w:val="28"/>
-        </w:rPr>
-        <w:t xml:space="preserve">4 </w:t>
-      </w:r>
-      <w:r>
-        <w:rPr>
-          <w:rFonts w:ascii="Times New Roman" w:hAnsi="Times New Roman" w:cs="Times New Roman"/>
-          <w:sz w:val="28"/>
-          <w:szCs w:val="28"/>
-        </w:rPr>
-        <w:t xml:space="preserve">– </w:t>
-      </w:r>
-      <w:r>
-        <w:rPr>
-          <w:rFonts w:ascii="Times New Roman" w:hAnsi="Times New Roman" w:cs="Times New Roman"/>
-          <w:sz w:val="28"/>
-          <w:szCs w:val="28"/>
-        </w:rPr>
-        <w:t>Трафик, генерируемый</w:t>
-      </w:r>
-      <w:r>
-        <w:rPr>
-          <w:rFonts w:ascii="Times New Roman" w:hAnsi="Times New Roman" w:cs="Times New Roman"/>
-          <w:sz w:val="28"/>
-          <w:szCs w:val="28"/>
-        </w:rPr>
-        <w:t xml:space="preserve"> системной утилит</w:t>
-      </w:r>
-      <w:r>
-        <w:rPr>
-          <w:rFonts w:ascii="Times New Roman" w:hAnsi="Times New Roman" w:cs="Times New Roman"/>
-          <w:sz w:val="28"/>
-          <w:szCs w:val="28"/>
-        </w:rPr>
-        <w:t xml:space="preserve">ой в </w:t>
+        <w:t xml:space="preserve">Рисунок 3 – Трафик, генерируемый разработанной утилитой в </w:t>
       </w:r>
       <w:r>
         <w:rPr>
@@ -1760,39 +1440,49 @@
     <w:p>
       <w:pPr>
         <w:spacing w:after="0"/>
-        <w:rPr>
-          <w:rFonts w:ascii="Times New Roman" w:hAnsi="Times New Roman" w:cs="Times New Roman"/>
-          <w:noProof/>
-          <w:sz w:val="28"/>
-          <w:szCs w:val="28"/>
-        </w:rPr>
-      </w:pPr>
-    </w:p>
-    <w:p>
-      <w:pPr>
-        <w:spacing w:after="0"/>
-        <w:jc w:val="center"/>
-        <w:rPr>
-          <w:rFonts w:ascii="Times New Roman" w:hAnsi="Times New Roman" w:cs="Times New Roman"/>
-          <w:noProof/>
-          <w:sz w:val="28"/>
-          <w:szCs w:val="28"/>
-          <w:lang w:val="en-US"/>
-        </w:rPr>
-      </w:pPr>
-      <w:r>
-        <w:rPr>
-          <w:rFonts w:ascii="Times New Roman" w:hAnsi="Times New Roman" w:cs="Times New Roman"/>
-          <w:noProof/>
-          <w:sz w:val="28"/>
-          <w:szCs w:val="28"/>
-          <w:lang w:val="en-US"/>
+        <w:jc w:val="center"/>
+        <w:rPr>
+          <w:rFonts w:ascii="Times New Roman" w:hAnsi="Times New Roman" w:cs="Times New Roman"/>
+          <w:noProof/>
+          <w:sz w:val="28"/>
+          <w:szCs w:val="28"/>
+        </w:rPr>
+      </w:pPr>
+    </w:p>
+    <w:p>
+      <w:pPr>
+        <w:spacing w:after="0"/>
+        <w:jc w:val="center"/>
+        <w:rPr>
+          <w:rFonts w:ascii="Times New Roman" w:hAnsi="Times New Roman" w:cs="Times New Roman"/>
+          <w:noProof/>
+          <w:sz w:val="28"/>
+          <w:szCs w:val="28"/>
+        </w:rPr>
+      </w:pPr>
+    </w:p>
+    <w:p>
+      <w:pPr>
+        <w:spacing w:after="0"/>
+        <w:jc w:val="center"/>
+        <w:rPr>
+          <w:rFonts w:ascii="Times New Roman" w:hAnsi="Times New Roman" w:cs="Times New Roman"/>
+          <w:sz w:val="28"/>
+          <w:szCs w:val="28"/>
+        </w:rPr>
+      </w:pPr>
+      <w:r>
+        <w:rPr>
+          <w:rFonts w:ascii="Times New Roman" w:hAnsi="Times New Roman" w:cs="Times New Roman"/>
+          <w:noProof/>
+          <w:sz w:val="28"/>
+          <w:szCs w:val="28"/>
         </w:rPr>
         <w:drawing>
-          <wp:inline distT="0" distB="0" distL="0" distR="0" wp14:anchorId="52AA22FA" wp14:editId="7B860B34">
-            <wp:extent cx="2461260" cy="1744980"/>
-            <wp:effectExtent l="0" t="0" r="0" b="7620"/>
-            <wp:docPr id="5" name="Рисунок 5"/>
+          <wp:inline distT="0" distB="0" distL="0" distR="0" wp14:anchorId="35405FB7" wp14:editId="2E51F7D0">
+            <wp:extent cx="6180219" cy="1539105"/>
+            <wp:effectExtent l="0" t="0" r="0" b="4445"/>
+            <wp:docPr id="19" name="Рисунок 19"/>
             <wp:cNvGraphicFramePr>
               <a:graphicFrameLocks xmlns:a="http://schemas.openxmlformats.org/drawingml/2006/main" noChangeAspect="1"/>
             </wp:cNvGraphicFramePr>
@@ -1800,7 +1490,178 @@
               <a:graphicData uri="http://schemas.openxmlformats.org/drawingml/2006/picture">
                 <pic:pic xmlns:pic="http://schemas.openxmlformats.org/drawingml/2006/picture">
                   <pic:nvPicPr>
-                    <pic:cNvPr id="0" name="Picture 5"/>
+                    <pic:cNvPr id="0" name="Picture 13"/>
+                    <pic:cNvPicPr>
+                      <a:picLocks noChangeAspect="1" noChangeArrowheads="1"/>
+                    </pic:cNvPicPr>
+                  </pic:nvPicPr>
+                  <pic:blipFill>
+                    <a:blip r:embed="rId11">
+                      <a:extLst>
+                        <a:ext uri="{28A0092B-C50C-407E-A947-70E740481C1C}">
+                          <a14:useLocalDpi xmlns:a14="http://schemas.microsoft.com/office/drawing/2010/main" val="0"/>
+                        </a:ext>
+                      </a:extLst>
+                    </a:blip>
+                    <a:srcRect/>
+                    <a:stretch>
+                      <a:fillRect/>
+                    </a:stretch>
+                  </pic:blipFill>
+                  <pic:spPr bwMode="auto">
+                    <a:xfrm>
+                      <a:off x="0" y="0"/>
+                      <a:ext cx="6213771" cy="1547461"/>
+                    </a:xfrm>
+                    <a:prstGeom prst="rect">
+                      <a:avLst/>
+                    </a:prstGeom>
+                    <a:noFill/>
+                    <a:ln>
+                      <a:noFill/>
+                    </a:ln>
+                  </pic:spPr>
+                </pic:pic>
+              </a:graphicData>
+            </a:graphic>
+          </wp:inline>
+        </w:drawing>
+      </w:r>
+    </w:p>
+    <w:p>
+      <w:pPr>
+        <w:spacing w:after="0"/>
+        <w:jc w:val="center"/>
+        <w:rPr>
+          <w:rFonts w:ascii="Times New Roman" w:hAnsi="Times New Roman" w:cs="Times New Roman"/>
+          <w:sz w:val="28"/>
+          <w:szCs w:val="28"/>
+        </w:rPr>
+      </w:pPr>
+    </w:p>
+    <w:p>
+      <w:pPr>
+        <w:spacing w:after="0"/>
+        <w:jc w:val="center"/>
+        <w:rPr>
+          <w:rFonts w:ascii="Times New Roman" w:hAnsi="Times New Roman" w:cs="Times New Roman"/>
+          <w:sz w:val="28"/>
+          <w:szCs w:val="28"/>
+        </w:rPr>
+      </w:pPr>
+      <w:r>
+        <w:rPr>
+          <w:rFonts w:ascii="Times New Roman" w:hAnsi="Times New Roman" w:cs="Times New Roman"/>
+          <w:sz w:val="28"/>
+          <w:szCs w:val="28"/>
+        </w:rPr>
+        <w:t xml:space="preserve">Рисунок </w:t>
+      </w:r>
+      <w:r>
+        <w:rPr>
+          <w:rFonts w:ascii="Times New Roman" w:hAnsi="Times New Roman" w:cs="Times New Roman"/>
+          <w:sz w:val="28"/>
+          <w:szCs w:val="28"/>
+        </w:rPr>
+        <w:t xml:space="preserve">4 </w:t>
+      </w:r>
+      <w:r>
+        <w:rPr>
+          <w:rFonts w:ascii="Times New Roman" w:hAnsi="Times New Roman" w:cs="Times New Roman"/>
+          <w:sz w:val="28"/>
+          <w:szCs w:val="28"/>
+        </w:rPr>
+        <w:t xml:space="preserve">– </w:t>
+      </w:r>
+      <w:r>
+        <w:rPr>
+          <w:rFonts w:ascii="Times New Roman" w:hAnsi="Times New Roman" w:cs="Times New Roman"/>
+          <w:sz w:val="28"/>
+          <w:szCs w:val="28"/>
+        </w:rPr>
+        <w:t>Трафик, генерируемый</w:t>
+      </w:r>
+      <w:r>
+        <w:rPr>
+          <w:rFonts w:ascii="Times New Roman" w:hAnsi="Times New Roman" w:cs="Times New Roman"/>
+          <w:sz w:val="28"/>
+          <w:szCs w:val="28"/>
+        </w:rPr>
+        <w:t xml:space="preserve"> системной утилит</w:t>
+      </w:r>
+      <w:r>
+        <w:rPr>
+          <w:rFonts w:ascii="Times New Roman" w:hAnsi="Times New Roman" w:cs="Times New Roman"/>
+          <w:sz w:val="28"/>
+          <w:szCs w:val="28"/>
+        </w:rPr>
+        <w:t xml:space="preserve">ой в </w:t>
+      </w:r>
+      <w:r>
+        <w:rPr>
+          <w:rFonts w:ascii="Times New Roman" w:hAnsi="Times New Roman" w:cs="Times New Roman"/>
+          <w:sz w:val="28"/>
+          <w:szCs w:val="28"/>
+          <w:lang w:val="en-US"/>
+        </w:rPr>
+        <w:t>Wireshark</w:t>
+      </w:r>
+    </w:p>
+    <w:p>
+      <w:pPr>
+        <w:spacing w:after="0"/>
+        <w:jc w:val="center"/>
+        <w:rPr>
+          <w:rFonts w:ascii="Times New Roman" w:hAnsi="Times New Roman" w:cs="Times New Roman"/>
+          <w:noProof/>
+          <w:sz w:val="28"/>
+          <w:szCs w:val="28"/>
+        </w:rPr>
+      </w:pPr>
+    </w:p>
+    <w:p>
+      <w:pPr>
+        <w:spacing w:after="0"/>
+        <w:rPr>
+          <w:rFonts w:ascii="Times New Roman" w:hAnsi="Times New Roman" w:cs="Times New Roman"/>
+          <w:noProof/>
+          <w:sz w:val="28"/>
+          <w:szCs w:val="28"/>
+        </w:rPr>
+      </w:pPr>
+    </w:p>
+    <w:p>
+      <w:pPr>
+        <w:spacing w:after="0"/>
+        <w:jc w:val="center"/>
+        <w:rPr>
+          <w:rFonts w:ascii="Times New Roman" w:hAnsi="Times New Roman" w:cs="Times New Roman"/>
+          <w:noProof/>
+          <w:sz w:val="28"/>
+          <w:szCs w:val="28"/>
+        </w:rPr>
+      </w:pPr>
+      <w:r>
+        <w:rPr>
+          <w:rFonts w:ascii="Times New Roman" w:hAnsi="Times New Roman" w:cs="Times New Roman"/>
+          <w:noProof/>
+          <w:sz w:val="28"/>
+          <w:szCs w:val="28"/>
+          <w:lang w:val="en-US"/>
+        </w:rPr>
+        <w:drawing>
+          <wp:inline distT="0" distB="0" distL="0" distR="0" wp14:anchorId="3E90947E" wp14:editId="03BEFF76">
+            <wp:extent cx="3447926" cy="1844040"/>
+            <wp:effectExtent l="0" t="0" r="635" b="3810"/>
+            <wp:docPr id="36" name="Рисунок 36"/>
+            <wp:cNvGraphicFramePr>
+              <a:graphicFrameLocks xmlns:a="http://schemas.openxmlformats.org/drawingml/2006/main" noChangeAspect="1"/>
+            </wp:cNvGraphicFramePr>
+            <a:graphic xmlns:a="http://schemas.openxmlformats.org/drawingml/2006/main">
+              <a:graphicData uri="http://schemas.openxmlformats.org/drawingml/2006/picture">
+                <pic:pic xmlns:pic="http://schemas.openxmlformats.org/drawingml/2006/picture">
+                  <pic:nvPicPr>
+                    <pic:cNvPr id="0" name="Picture 23"/>
                     <pic:cNvPicPr>
                       <a:picLocks noChangeAspect="1" noChangeArrowheads="1"/>
                     </pic:cNvPicPr>
@@ -1821,7 +1682,7 @@
                   <pic:spPr bwMode="auto">
                     <a:xfrm>
                       <a:off x="0" y="0"/>
-                      <a:ext cx="2461260" cy="1744980"/>
+                      <a:ext cx="3450517" cy="1845426"/>
                     </a:xfrm>
                     <a:prstGeom prst="rect">
                       <a:avLst/>
@@ -1847,7 +1708,6 @@
           <w:noProof/>
           <w:sz w:val="28"/>
           <w:szCs w:val="28"/>
-          <w:lang w:val="en-US"/>
         </w:rPr>
       </w:pPr>
     </w:p>
@@ -1922,30 +1782,6 @@
           <w:szCs w:val="28"/>
         </w:rPr>
       </w:pPr>
-    </w:p>
-    <w:p>
-      <w:pPr>
-        <w:spacing w:after="0"/>
-        <w:jc w:val="center"/>
-        <w:rPr>
-          <w:rFonts w:ascii="Times New Roman" w:hAnsi="Times New Roman" w:cs="Times New Roman"/>
-          <w:noProof/>
-          <w:sz w:val="28"/>
-          <w:szCs w:val="28"/>
-        </w:rPr>
-      </w:pPr>
-    </w:p>
-    <w:p>
-      <w:pPr>
-        <w:spacing w:after="0"/>
-        <w:jc w:val="center"/>
-        <w:rPr>
-          <w:rFonts w:ascii="Times New Roman" w:hAnsi="Times New Roman" w:cs="Times New Roman"/>
-          <w:noProof/>
-          <w:sz w:val="28"/>
-          <w:szCs w:val="28"/>
-        </w:rPr>
-      </w:pPr>
       <w:r>
         <w:rPr>
           <w:rFonts w:ascii="Times New Roman" w:hAnsi="Times New Roman" w:cs="Times New Roman"/>
@@ -1954,10 +1790,10 @@
           <w:szCs w:val="28"/>
         </w:rPr>
         <w:drawing>
-          <wp:inline distT="0" distB="0" distL="0" distR="0" wp14:anchorId="6B7E0901" wp14:editId="2893467A">
-            <wp:extent cx="3144520" cy="1604010"/>
-            <wp:effectExtent l="0" t="0" r="0" b="0"/>
-            <wp:docPr id="22" name="Рисунок 22"/>
+          <wp:inline distT="0" distB="0" distL="0" distR="0" wp14:anchorId="0C91558C" wp14:editId="43A89A4F">
+            <wp:extent cx="3218336" cy="1744980"/>
+            <wp:effectExtent l="0" t="0" r="1270" b="7620"/>
+            <wp:docPr id="37" name="Рисунок 37"/>
             <wp:cNvGraphicFramePr>
               <a:graphicFrameLocks xmlns:a="http://schemas.openxmlformats.org/drawingml/2006/main" noChangeAspect="1"/>
             </wp:cNvGraphicFramePr>
@@ -1965,7 +1801,7 @@
               <a:graphicData uri="http://schemas.openxmlformats.org/drawingml/2006/picture">
                 <pic:pic xmlns:pic="http://schemas.openxmlformats.org/drawingml/2006/picture">
                   <pic:nvPicPr>
-                    <pic:cNvPr id="0" name="Picture 14"/>
+                    <pic:cNvPr id="0" name="Picture 24"/>
                     <pic:cNvPicPr>
                       <a:picLocks noChangeAspect="1" noChangeArrowheads="1"/>
                     </pic:cNvPicPr>
@@ -1986,7 +1822,7 @@
                   <pic:spPr bwMode="auto">
                     <a:xfrm>
                       <a:off x="0" y="0"/>
-                      <a:ext cx="3144520" cy="1604010"/>
+                      <a:ext cx="3220917" cy="1746379"/>
                     </a:xfrm>
                     <a:prstGeom prst="rect">
                       <a:avLst/>
@@ -2006,19 +1842,70 @@
     <w:p>
       <w:pPr>
         <w:spacing w:after="0"/>
-        <w:jc w:val="center"/>
-        <w:rPr>
-          <w:rFonts w:ascii="Times New Roman" w:hAnsi="Times New Roman" w:cs="Times New Roman"/>
-          <w:noProof/>
-          <w:sz w:val="28"/>
-          <w:szCs w:val="28"/>
-        </w:rPr>
-      </w:pPr>
-    </w:p>
-    <w:p>
-      <w:pPr>
-        <w:spacing w:after="0"/>
-        <w:jc w:val="center"/>
+        <w:rPr>
+          <w:rFonts w:ascii="Times New Roman" w:hAnsi="Times New Roman" w:cs="Times New Roman"/>
+          <w:noProof/>
+          <w:sz w:val="28"/>
+          <w:szCs w:val="28"/>
+        </w:rPr>
+      </w:pPr>
+    </w:p>
+    <w:p>
+      <w:pPr>
+        <w:spacing w:after="0"/>
+        <w:jc w:val="center"/>
+        <w:rPr>
+          <w:rFonts w:ascii="Times New Roman" w:hAnsi="Times New Roman" w:cs="Times New Roman"/>
+          <w:sz w:val="28"/>
+          <w:szCs w:val="28"/>
+        </w:rPr>
+      </w:pPr>
+      <w:r>
+        <w:rPr>
+          <w:rFonts w:ascii="Times New Roman" w:hAnsi="Times New Roman" w:cs="Times New Roman"/>
+          <w:noProof/>
+          <w:sz w:val="28"/>
+          <w:szCs w:val="28"/>
+        </w:rPr>
+        <w:t>Рисунок</w:t>
+      </w:r>
+      <w:r>
+        <w:rPr>
+          <w:rFonts w:ascii="Times New Roman" w:hAnsi="Times New Roman" w:cs="Times New Roman"/>
+          <w:noProof/>
+          <w:sz w:val="28"/>
+          <w:szCs w:val="28"/>
+        </w:rPr>
+        <w:t xml:space="preserve"> </w:t>
+      </w:r>
+      <w:r>
+        <w:rPr>
+          <w:rFonts w:ascii="Times New Roman" w:hAnsi="Times New Roman" w:cs="Times New Roman"/>
+          <w:noProof/>
+          <w:sz w:val="28"/>
+          <w:szCs w:val="28"/>
+        </w:rPr>
+        <w:t>6</w:t>
+      </w:r>
+      <w:r>
+        <w:rPr>
+          <w:rFonts w:ascii="Times New Roman" w:hAnsi="Times New Roman" w:cs="Times New Roman"/>
+          <w:noProof/>
+          <w:sz w:val="28"/>
+          <w:szCs w:val="28"/>
+        </w:rPr>
+        <w:t xml:space="preserve"> </w:t>
+      </w:r>
+      <w:r>
+        <w:rPr>
+          <w:rFonts w:ascii="Times New Roman" w:hAnsi="Times New Roman" w:cs="Times New Roman"/>
+          <w:noProof/>
+          <w:sz w:val="28"/>
+          <w:szCs w:val="28"/>
+        </w:rPr>
+        <w:t>–</w:t>
+      </w:r>
+      <w:r>
         <w:rPr>
           <w:rFonts w:ascii="Times New Roman" w:hAnsi="Times New Roman" w:cs="Times New Roman"/>
           <w:noProof/>
@@ -2026,54 +1913,45 @@
           <w:szCs w:val="28"/>
           <w:lang w:val="en-US"/>
         </w:rPr>
-      </w:pPr>
-    </w:p>
-    <w:p>
-      <w:pPr>
-        <w:spacing w:after="0"/>
-        <w:jc w:val="center"/>
-        <w:rPr>
-          <w:rFonts w:ascii="Times New Roman" w:hAnsi="Times New Roman" w:cs="Times New Roman"/>
-          <w:noProof/>
-          <w:sz w:val="28"/>
-          <w:szCs w:val="28"/>
-        </w:rPr>
-      </w:pPr>
-      <w:r>
-        <w:rPr>
-          <w:rFonts w:ascii="Times New Roman" w:hAnsi="Times New Roman" w:cs="Times New Roman"/>
-          <w:noProof/>
-          <w:sz w:val="28"/>
-          <w:szCs w:val="28"/>
-        </w:rPr>
-        <w:t xml:space="preserve">Рисунок </w:t>
-      </w:r>
-      <w:r>
-        <w:rPr>
-          <w:rFonts w:ascii="Times New Roman" w:hAnsi="Times New Roman" w:cs="Times New Roman"/>
-          <w:noProof/>
-          <w:sz w:val="28"/>
-          <w:szCs w:val="28"/>
-        </w:rPr>
-        <w:t>6</w:t>
-      </w:r>
-      <w:r>
-        <w:rPr>
-          <w:rFonts w:ascii="Times New Roman" w:hAnsi="Times New Roman" w:cs="Times New Roman"/>
-          <w:noProof/>
-          <w:sz w:val="28"/>
-          <w:szCs w:val="28"/>
-        </w:rPr>
-        <w:t xml:space="preserve"> –</w:t>
-      </w:r>
-      <w:r>
-        <w:rPr>
-          <w:rFonts w:ascii="Times New Roman" w:hAnsi="Times New Roman" w:cs="Times New Roman"/>
-          <w:noProof/>
-          <w:sz w:val="28"/>
-          <w:szCs w:val="28"/>
-        </w:rPr>
-        <w:t>ICMP Echo Reply от конечного узла</w:t>
+        <w:t>ICMP</w:t>
+      </w:r>
+      <w:r>
+        <w:rPr>
+          <w:rFonts w:ascii="Times New Roman" w:hAnsi="Times New Roman" w:cs="Times New Roman"/>
+          <w:noProof/>
+          <w:sz w:val="28"/>
+          <w:szCs w:val="28"/>
+        </w:rPr>
+        <w:t xml:space="preserve"> </w:t>
+      </w:r>
+      <w:r>
+        <w:rPr>
+          <w:rFonts w:ascii="Times New Roman" w:hAnsi="Times New Roman" w:cs="Times New Roman"/>
+          <w:noProof/>
+          <w:sz w:val="28"/>
+          <w:szCs w:val="28"/>
+          <w:lang w:val="en-US"/>
+        </w:rPr>
+        <w:t>Echo</w:t>
+      </w:r>
+      <w:r>
+        <w:rPr>
+          <w:rFonts w:ascii="Times New Roman" w:hAnsi="Times New Roman" w:cs="Times New Roman"/>
+          <w:noProof/>
+          <w:sz w:val="28"/>
+          <w:szCs w:val="28"/>
+        </w:rPr>
+        <w:t xml:space="preserve"> </w:t>
+      </w:r>
+      <w:r>
+        <w:rPr>
+          <w:rFonts w:ascii="Times New Roman" w:hAnsi="Times New Roman" w:cs="Times New Roman"/>
+          <w:noProof/>
+          <w:sz w:val="28"/>
+          <w:szCs w:val="28"/>
+          <w:lang w:val="en-US"/>
+        </w:rPr>
+        <w:t>Request</w:t>
       </w:r>
       <w:r>
         <w:rPr>
@@ -2091,16 +1969,7 @@
           <w:sz w:val="28"/>
           <w:szCs w:val="28"/>
         </w:rPr>
-        <w:t>разработанная</w:t>
-      </w:r>
-      <w:r>
-        <w:rPr>
-          <w:rFonts w:ascii="Times New Roman" w:hAnsi="Times New Roman" w:cs="Times New Roman"/>
-          <w:noProof/>
-          <w:sz w:val="28"/>
-          <w:szCs w:val="28"/>
-        </w:rPr>
-        <w:t xml:space="preserve"> утилита)</w:t>
+        <w:t>системная утилита)</w:t>
       </w:r>
     </w:p>
     <w:p>
@@ -2146,10 +2015,10 @@
           <w:szCs w:val="28"/>
         </w:rPr>
         <w:drawing>
-          <wp:inline distT="0" distB="0" distL="0" distR="0" wp14:anchorId="257D41E6" wp14:editId="3E9F13A1">
-            <wp:extent cx="3120390" cy="2855595"/>
-            <wp:effectExtent l="0" t="0" r="3810" b="1905"/>
-            <wp:docPr id="24" name="Рисунок 24"/>
+          <wp:inline distT="0" distB="0" distL="0" distR="0" wp14:anchorId="1271D8FF" wp14:editId="2B627FA7">
+            <wp:extent cx="3037828" cy="1714500"/>
+            <wp:effectExtent l="0" t="0" r="0" b="0"/>
+            <wp:docPr id="33" name="Рисунок 33"/>
             <wp:cNvGraphicFramePr>
               <a:graphicFrameLocks xmlns:a="http://schemas.openxmlformats.org/drawingml/2006/main" noChangeAspect="1"/>
             </wp:cNvGraphicFramePr>
@@ -2157,7 +2026,7 @@
               <a:graphicData uri="http://schemas.openxmlformats.org/drawingml/2006/picture">
                 <pic:pic xmlns:pic="http://schemas.openxmlformats.org/drawingml/2006/picture">
                   <pic:nvPicPr>
-                    <pic:cNvPr id="0" name="Picture 16"/>
+                    <pic:cNvPr id="0" name="Picture 20"/>
                     <pic:cNvPicPr>
                       <a:picLocks noChangeAspect="1" noChangeArrowheads="1"/>
                     </pic:cNvPicPr>
@@ -2178,7 +2047,7 @@
                   <pic:spPr bwMode="auto">
                     <a:xfrm>
                       <a:off x="0" y="0"/>
-                      <a:ext cx="3120390" cy="2855595"/>
+                      <a:ext cx="3040023" cy="1715739"/>
                     </a:xfrm>
                     <a:prstGeom prst="rect">
                       <a:avLst/>
@@ -2216,6 +2085,19 @@
           <w:noProof/>
           <w:sz w:val="28"/>
           <w:szCs w:val="28"/>
+          <w:lang w:val="en-US"/>
+        </w:rPr>
+      </w:pPr>
+    </w:p>
+    <w:p>
+      <w:pPr>
+        <w:spacing w:after="0"/>
+        <w:jc w:val="center"/>
+        <w:rPr>
+          <w:rFonts w:ascii="Times New Roman" w:hAnsi="Times New Roman" w:cs="Times New Roman"/>
+          <w:noProof/>
+          <w:sz w:val="28"/>
+          <w:szCs w:val="28"/>
         </w:rPr>
       </w:pPr>
       <w:r>
@@ -2252,146 +2134,66 @@
           <w:sz w:val="28"/>
           <w:szCs w:val="28"/>
         </w:rPr>
-        <w:t xml:space="preserve"> </w:t>
-      </w:r>
-      <w:r>
-        <w:rPr>
-          <w:rFonts w:ascii="Times New Roman" w:hAnsi="Times New Roman" w:cs="Times New Roman"/>
-          <w:noProof/>
-          <w:sz w:val="28"/>
-          <w:szCs w:val="28"/>
-          <w:lang w:val="en-US"/>
-        </w:rPr>
-        <w:t>ICMP</w:t>
-      </w:r>
-      <w:r>
-        <w:rPr>
-          <w:rFonts w:ascii="Times New Roman" w:hAnsi="Times New Roman" w:cs="Times New Roman"/>
-          <w:noProof/>
-          <w:sz w:val="28"/>
-          <w:szCs w:val="28"/>
-        </w:rPr>
-        <w:t xml:space="preserve"> </w:t>
-      </w:r>
-      <w:r>
-        <w:rPr>
-          <w:rFonts w:ascii="Times New Roman" w:hAnsi="Times New Roman" w:cs="Times New Roman"/>
-          <w:noProof/>
-          <w:sz w:val="28"/>
-          <w:szCs w:val="28"/>
-          <w:lang w:val="en-US"/>
-        </w:rPr>
-        <w:t>Echo</w:t>
-      </w:r>
-      <w:r>
-        <w:rPr>
-          <w:rFonts w:ascii="Times New Roman" w:hAnsi="Times New Roman" w:cs="Times New Roman"/>
-          <w:noProof/>
-          <w:sz w:val="28"/>
-          <w:szCs w:val="28"/>
-        </w:rPr>
-        <w:t xml:space="preserve"> </w:t>
-      </w:r>
-      <w:r>
-        <w:rPr>
-          <w:rFonts w:ascii="Times New Roman" w:hAnsi="Times New Roman" w:cs="Times New Roman"/>
-          <w:noProof/>
-          <w:sz w:val="28"/>
-          <w:szCs w:val="28"/>
-          <w:lang w:val="en-US"/>
-        </w:rPr>
-        <w:t>Request</w:t>
-      </w:r>
-      <w:r>
-        <w:rPr>
-          <w:rFonts w:ascii="Times New Roman" w:hAnsi="Times New Roman" w:cs="Times New Roman"/>
-          <w:noProof/>
-          <w:sz w:val="28"/>
-          <w:szCs w:val="28"/>
-        </w:rPr>
-        <w:t xml:space="preserve"> </w:t>
-      </w:r>
-      <w:r>
-        <w:rPr>
-          <w:rFonts w:ascii="Times New Roman" w:hAnsi="Times New Roman" w:cs="Times New Roman"/>
-          <w:noProof/>
-          <w:sz w:val="28"/>
-          <w:szCs w:val="28"/>
-        </w:rPr>
-        <w:t>с</w:t>
-      </w:r>
-      <w:r>
-        <w:rPr>
-          <w:rFonts w:ascii="Times New Roman" w:hAnsi="Times New Roman" w:cs="Times New Roman"/>
-          <w:noProof/>
-          <w:sz w:val="28"/>
-          <w:szCs w:val="28"/>
-        </w:rPr>
-        <w:t xml:space="preserve"> </w:t>
-      </w:r>
-      <w:r>
-        <w:rPr>
-          <w:rFonts w:ascii="Times New Roman" w:hAnsi="Times New Roman" w:cs="Times New Roman"/>
-          <w:noProof/>
-          <w:sz w:val="28"/>
-          <w:szCs w:val="28"/>
-          <w:lang w:val="en-US"/>
-        </w:rPr>
-        <w:t>TTL</w:t>
-      </w:r>
-      <w:r>
-        <w:rPr>
-          <w:rFonts w:ascii="Times New Roman" w:hAnsi="Times New Roman" w:cs="Times New Roman"/>
-          <w:noProof/>
-          <w:sz w:val="28"/>
-          <w:szCs w:val="28"/>
-        </w:rPr>
-        <w:t xml:space="preserve">=10 </w:t>
-      </w:r>
-      <w:r>
-        <w:rPr>
-          <w:rFonts w:ascii="Times New Roman" w:hAnsi="Times New Roman" w:cs="Times New Roman"/>
-          <w:noProof/>
-          <w:sz w:val="28"/>
-          <w:szCs w:val="28"/>
-        </w:rPr>
-        <w:t>(разработанная утилита)</w:t>
-      </w:r>
-    </w:p>
-    <w:p>
-      <w:pPr>
-        <w:spacing w:after="0"/>
-        <w:jc w:val="center"/>
-        <w:rPr>
-          <w:rFonts w:ascii="Times New Roman" w:hAnsi="Times New Roman" w:cs="Times New Roman"/>
-          <w:noProof/>
-          <w:sz w:val="28"/>
-          <w:szCs w:val="28"/>
-        </w:rPr>
-      </w:pPr>
-    </w:p>
-    <w:p>
-      <w:pPr>
-        <w:spacing w:after="0"/>
-        <w:jc w:val="center"/>
-        <w:rPr>
-          <w:rFonts w:ascii="Times New Roman" w:hAnsi="Times New Roman" w:cs="Times New Roman"/>
-          <w:sz w:val="28"/>
-          <w:szCs w:val="28"/>
-        </w:rPr>
-      </w:pPr>
-      <w:r>
-        <w:rPr>
-          <w:rFonts w:ascii="Times New Roman" w:hAnsi="Times New Roman" w:cs="Times New Roman"/>
-          <w:noProof/>
-          <w:sz w:val="28"/>
-          <w:szCs w:val="28"/>
-        </w:rPr>
+        <w:t>ICMP Echo Reply от конечного узла</w:t>
+      </w:r>
+      <w:r>
+        <w:rPr>
+          <w:rFonts w:ascii="Times New Roman" w:hAnsi="Times New Roman" w:cs="Times New Roman"/>
+          <w:noProof/>
+          <w:sz w:val="28"/>
+          <w:szCs w:val="28"/>
+        </w:rPr>
+        <w:t xml:space="preserve"> (разработанная утилита)</w:t>
+      </w:r>
+    </w:p>
+    <w:p>
+      <w:pPr>
+        <w:spacing w:after="0"/>
+        <w:jc w:val="center"/>
+        <w:rPr>
+          <w:rFonts w:ascii="Times New Roman" w:hAnsi="Times New Roman" w:cs="Times New Roman"/>
+          <w:noProof/>
+          <w:sz w:val="28"/>
+          <w:szCs w:val="28"/>
+        </w:rPr>
+      </w:pPr>
+    </w:p>
+    <w:p>
+      <w:pPr>
+        <w:spacing w:after="0"/>
+        <w:jc w:val="center"/>
+        <w:rPr>
+          <w:rFonts w:ascii="Times New Roman" w:hAnsi="Times New Roman" w:cs="Times New Roman"/>
+          <w:noProof/>
+          <w:sz w:val="28"/>
+          <w:szCs w:val="28"/>
+        </w:rPr>
+      </w:pPr>
+    </w:p>
+    <w:p>
+      <w:pPr>
+        <w:spacing w:after="0"/>
+        <w:jc w:val="center"/>
+        <w:rPr>
+          <w:rFonts w:ascii="Times New Roman" w:hAnsi="Times New Roman" w:cs="Times New Roman"/>
+          <w:noProof/>
+          <w:sz w:val="28"/>
+          <w:szCs w:val="28"/>
+        </w:rPr>
+      </w:pPr>
+      <w:r>
+        <w:rPr>
+          <w:rFonts w:ascii="Times New Roman" w:hAnsi="Times New Roman" w:cs="Times New Roman"/>
+          <w:noProof/>
+          <w:sz w:val="28"/>
+          <w:szCs w:val="28"/>
+        </w:rPr>
+        <w:lastRenderedPageBreak/>
         <w:drawing>
-          <wp:inline distT="0" distB="0" distL="0" distR="0" wp14:anchorId="0F2C3C2A" wp14:editId="6EF2D454">
-            <wp:extent cx="5935980" cy="3253740"/>
-            <wp:effectExtent l="0" t="0" r="7620" b="3810"/>
-            <wp:docPr id="9" name="Рисунок 9"/>
+          <wp:inline distT="0" distB="0" distL="0" distR="0" wp14:anchorId="478957E6" wp14:editId="29DAC935">
+            <wp:extent cx="2674620" cy="1653540"/>
+            <wp:effectExtent l="0" t="0" r="0" b="3810"/>
+            <wp:docPr id="34" name="Рисунок 34"/>
             <wp:cNvGraphicFramePr>
               <a:graphicFrameLocks xmlns:a="http://schemas.openxmlformats.org/drawingml/2006/main" noChangeAspect="1"/>
             </wp:cNvGraphicFramePr>
@@ -2399,12 +2201,12 @@
               <a:graphicData uri="http://schemas.openxmlformats.org/drawingml/2006/picture">
                 <pic:pic xmlns:pic="http://schemas.openxmlformats.org/drawingml/2006/picture">
                   <pic:nvPicPr>
-                    <pic:cNvPr id="0" name="Picture 7"/>
+                    <pic:cNvPr id="0" name="Picture 21"/>
                     <pic:cNvPicPr>
                       <a:picLocks noChangeAspect="1" noChangeArrowheads="1"/>
                     </pic:cNvPicPr>
                   </pic:nvPicPr>
-                  <pic:blipFill rotWithShape="1">
+                  <pic:blipFill>
                     <a:blip r:embed="rId15">
                       <a:extLst>
                         <a:ext uri="{28A0092B-C50C-407E-A947-70E740481C1C}">
@@ -2412,13 +2214,15 @@
                         </a:ext>
                       </a:extLst>
                     </a:blip>
-                    <a:srcRect t="29770"/>
-                    <a:stretch/>
+                    <a:srcRect/>
+                    <a:stretch>
+                      <a:fillRect/>
+                    </a:stretch>
                   </pic:blipFill>
                   <pic:spPr bwMode="auto">
                     <a:xfrm>
                       <a:off x="0" y="0"/>
-                      <a:ext cx="5935980" cy="3253740"/>
+                      <a:ext cx="2674620" cy="1653540"/>
                     </a:xfrm>
                     <a:prstGeom prst="rect">
                       <a:avLst/>
@@ -2427,11 +2231,6 @@
                     <a:ln>
                       <a:noFill/>
                     </a:ln>
-                    <a:extLst>
-                      <a:ext uri="{53640926-AAD7-44D8-BBD7-CCE9431645EC}">
-                        <a14:shadowObscured xmlns:a14="http://schemas.microsoft.com/office/drawing/2010/main"/>
-                      </a:ext>
-                    </a:extLst>
                   </pic:spPr>
                 </pic:pic>
               </a:graphicData>
@@ -2458,18 +2257,37 @@
         <w:jc w:val="center"/>
         <w:rPr>
           <w:rFonts w:ascii="Times New Roman" w:hAnsi="Times New Roman" w:cs="Times New Roman"/>
-          <w:sz w:val="28"/>
-          <w:szCs w:val="28"/>
-        </w:rPr>
-      </w:pPr>
-      <w:r>
-        <w:rPr>
-          <w:rFonts w:ascii="Times New Roman" w:hAnsi="Times New Roman" w:cs="Times New Roman"/>
-          <w:noProof/>
-          <w:sz w:val="28"/>
-          <w:szCs w:val="28"/>
-        </w:rPr>
-        <w:t>Рисунок</w:t>
+          <w:noProof/>
+          <w:sz w:val="28"/>
+          <w:szCs w:val="28"/>
+        </w:rPr>
+      </w:pPr>
+      <w:r>
+        <w:rPr>
+          <w:rFonts w:ascii="Times New Roman" w:hAnsi="Times New Roman" w:cs="Times New Roman"/>
+          <w:noProof/>
+          <w:sz w:val="28"/>
+          <w:szCs w:val="28"/>
+        </w:rPr>
+        <w:t xml:space="preserve">Рисунок </w:t>
+      </w:r>
+      <w:r>
+        <w:rPr>
+          <w:rFonts w:ascii="Times New Roman" w:hAnsi="Times New Roman" w:cs="Times New Roman"/>
+          <w:noProof/>
+          <w:sz w:val="28"/>
+          <w:szCs w:val="28"/>
+        </w:rPr>
+        <w:t>8</w:t>
+      </w:r>
+      <w:r>
+        <w:rPr>
+          <w:rFonts w:ascii="Times New Roman" w:hAnsi="Times New Roman" w:cs="Times New Roman"/>
+          <w:noProof/>
+          <w:sz w:val="28"/>
+          <w:szCs w:val="28"/>
+        </w:rPr>
+        <w:t xml:space="preserve"> –</w:t>
       </w:r>
       <w:r>
         <w:rPr>
@@ -2486,24 +2304,6 @@
           <w:noProof/>
           <w:sz w:val="28"/>
           <w:szCs w:val="28"/>
-        </w:rPr>
-        <w:t xml:space="preserve">8 </w:t>
-      </w:r>
-      <w:r>
-        <w:rPr>
-          <w:rFonts w:ascii="Times New Roman" w:hAnsi="Times New Roman" w:cs="Times New Roman"/>
-          <w:noProof/>
-          <w:sz w:val="28"/>
-          <w:szCs w:val="28"/>
-        </w:rPr>
-        <w:t>–</w:t>
-      </w:r>
-      <w:r>
-        <w:rPr>
-          <w:rFonts w:ascii="Times New Roman" w:hAnsi="Times New Roman" w:cs="Times New Roman"/>
-          <w:noProof/>
-          <w:sz w:val="28"/>
-          <w:szCs w:val="28"/>
           <w:lang w:val="en-US"/>
         </w:rPr>
         <w:t>ICMP</w:t>
@@ -2562,90 +2362,44 @@
           <w:sz w:val="28"/>
           <w:szCs w:val="28"/>
         </w:rPr>
-        <w:t>с</w:t>
-      </w:r>
-      <w:r>
-        <w:rPr>
-          <w:rFonts w:ascii="Times New Roman" w:hAnsi="Times New Roman" w:cs="Times New Roman"/>
-          <w:noProof/>
-          <w:sz w:val="28"/>
-          <w:szCs w:val="28"/>
-        </w:rPr>
-        <w:t xml:space="preserve"> </w:t>
-      </w:r>
-      <w:r>
-        <w:rPr>
-          <w:rFonts w:ascii="Times New Roman" w:hAnsi="Times New Roman" w:cs="Times New Roman"/>
-          <w:noProof/>
+        <w:t>(разработанная утилита)</w:t>
+      </w:r>
+    </w:p>
+    <w:p>
+      <w:pPr>
+        <w:spacing w:after="0"/>
+        <w:jc w:val="center"/>
+        <w:rPr>
+          <w:rFonts w:ascii="Times New Roman" w:hAnsi="Times New Roman" w:cs="Times New Roman"/>
+          <w:sz w:val="28"/>
+          <w:szCs w:val="28"/>
+        </w:rPr>
+      </w:pPr>
+    </w:p>
+    <w:p>
+      <w:pPr>
+        <w:spacing w:after="0"/>
+        <w:jc w:val="center"/>
+        <w:rPr>
+          <w:rFonts w:ascii="Times New Roman" w:hAnsi="Times New Roman" w:cs="Times New Roman"/>
           <w:sz w:val="28"/>
           <w:szCs w:val="28"/>
           <w:lang w:val="en-US"/>
         </w:rPr>
-        <w:t>TTL</w:t>
-      </w:r>
-      <w:r>
-        <w:rPr>
-          <w:rFonts w:ascii="Times New Roman" w:hAnsi="Times New Roman" w:cs="Times New Roman"/>
-          <w:noProof/>
-          <w:sz w:val="28"/>
-          <w:szCs w:val="28"/>
-        </w:rPr>
-        <w:t>=10</w:t>
-      </w:r>
-      <w:r>
-        <w:rPr>
-          <w:rFonts w:ascii="Times New Roman" w:hAnsi="Times New Roman" w:cs="Times New Roman"/>
-          <w:noProof/>
-          <w:sz w:val="28"/>
-          <w:szCs w:val="28"/>
-        </w:rPr>
-        <w:t xml:space="preserve"> (</w:t>
-      </w:r>
-      <w:r>
-        <w:rPr>
-          <w:rFonts w:ascii="Times New Roman" w:hAnsi="Times New Roman" w:cs="Times New Roman"/>
-          <w:noProof/>
-          <w:sz w:val="28"/>
-          <w:szCs w:val="28"/>
-        </w:rPr>
-        <w:t>системная утилита)</w:t>
-      </w:r>
-    </w:p>
-    <w:p>
-      <w:pPr>
-        <w:spacing w:after="0"/>
-        <w:jc w:val="center"/>
-        <w:rPr>
-          <w:rFonts w:ascii="Times New Roman" w:hAnsi="Times New Roman" w:cs="Times New Roman"/>
-          <w:sz w:val="28"/>
-          <w:szCs w:val="28"/>
-        </w:rPr>
-      </w:pPr>
-    </w:p>
-    <w:p>
-      <w:pPr>
-        <w:spacing w:after="0"/>
-        <w:jc w:val="center"/>
-        <w:rPr>
-          <w:rFonts w:ascii="Times New Roman" w:hAnsi="Times New Roman" w:cs="Times New Roman"/>
+      </w:pPr>
+      <w:r>
+        <w:rPr>
+          <w:rFonts w:ascii="Times New Roman" w:hAnsi="Times New Roman" w:cs="Times New Roman"/>
+          <w:noProof/>
           <w:sz w:val="28"/>
           <w:szCs w:val="28"/>
           <w:lang w:val="en-US"/>
         </w:rPr>
-      </w:pPr>
-      <w:r>
-        <w:rPr>
-          <w:rFonts w:ascii="Times New Roman" w:hAnsi="Times New Roman" w:cs="Times New Roman"/>
-          <w:noProof/>
-          <w:sz w:val="28"/>
-          <w:szCs w:val="28"/>
-          <w:lang w:val="en-US"/>
-        </w:rPr>
         <w:drawing>
-          <wp:inline distT="0" distB="0" distL="0" distR="0" wp14:anchorId="2248B811" wp14:editId="42A24092">
-            <wp:extent cx="4632960" cy="2811780"/>
-            <wp:effectExtent l="0" t="0" r="0" b="7620"/>
-            <wp:docPr id="10" name="Рисунок 10"/>
+          <wp:inline distT="0" distB="0" distL="0" distR="0" wp14:anchorId="35B11B7A" wp14:editId="28E4C16C">
+            <wp:extent cx="4846320" cy="2834640"/>
+            <wp:effectExtent l="0" t="0" r="0" b="3810"/>
+            <wp:docPr id="28" name="Рисунок 28"/>
             <wp:cNvGraphicFramePr>
               <a:graphicFrameLocks xmlns:a="http://schemas.openxmlformats.org/drawingml/2006/main" noChangeAspect="1"/>
             </wp:cNvGraphicFramePr>
@@ -2653,7 +2407,7 @@
               <a:graphicData uri="http://schemas.openxmlformats.org/drawingml/2006/picture">
                 <pic:pic xmlns:pic="http://schemas.openxmlformats.org/drawingml/2006/picture">
                   <pic:nvPicPr>
-                    <pic:cNvPr id="0" name="Picture 8"/>
+                    <pic:cNvPr id="0" name="Picture 18"/>
                     <pic:cNvPicPr>
                       <a:picLocks noChangeAspect="1" noChangeArrowheads="1"/>
                     </pic:cNvPicPr>
@@ -2674,7 +2428,7 @@
                   <pic:spPr bwMode="auto">
                     <a:xfrm>
                       <a:off x="0" y="0"/>
-                      <a:ext cx="4632960" cy="2811780"/>
+                      <a:ext cx="4846320" cy="2834640"/>
                     </a:xfrm>
                     <a:prstGeom prst="rect">
                       <a:avLst/>
@@ -2770,21 +2524,44 @@
       <w:r>
         <w:rPr>
           <w:rFonts w:ascii="Times New Roman" w:hAnsi="Times New Roman" w:cs="Times New Roman"/>
-          <w:sz w:val="28"/>
-          <w:szCs w:val="28"/>
-        </w:rPr>
-        <w:t xml:space="preserve">ICMP Time </w:t>
-      </w:r>
-      <w:proofErr w:type="spellStart"/>
-      <w:r>
-        <w:rPr>
-          <w:rFonts w:ascii="Times New Roman" w:hAnsi="Times New Roman" w:cs="Times New Roman"/>
-          <w:sz w:val="28"/>
-          <w:szCs w:val="28"/>
-        </w:rPr>
-        <w:t>Exceeded</w:t>
-      </w:r>
-      <w:proofErr w:type="spellEnd"/>
+          <w:noProof/>
+          <w:sz w:val="28"/>
+          <w:szCs w:val="28"/>
+        </w:rPr>
+        <w:t xml:space="preserve">структура </w:t>
+      </w:r>
+      <w:r>
+        <w:rPr>
+          <w:rFonts w:ascii="Times New Roman" w:hAnsi="Times New Roman" w:cs="Times New Roman"/>
+          <w:sz w:val="28"/>
+          <w:szCs w:val="28"/>
+        </w:rPr>
+        <w:t xml:space="preserve">ICMP </w:t>
+      </w:r>
+      <w:r>
+        <w:rPr>
+          <w:rFonts w:ascii="Times New Roman" w:hAnsi="Times New Roman" w:cs="Times New Roman"/>
+          <w:sz w:val="28"/>
+          <w:szCs w:val="28"/>
+        </w:rPr>
+        <w:t>пакета (</w:t>
+      </w:r>
+      <w:r>
+        <w:rPr>
+          <w:rFonts w:ascii="Times New Roman" w:hAnsi="Times New Roman" w:cs="Times New Roman"/>
+          <w:sz w:val="28"/>
+          <w:szCs w:val="28"/>
+        </w:rPr>
+        <w:t>Time Exceeded</w:t>
+      </w:r>
+      <w:r>
+        <w:rPr>
+          <w:rFonts w:ascii="Times New Roman" w:hAnsi="Times New Roman" w:cs="Times New Roman"/>
+          <w:sz w:val="28"/>
+          <w:szCs w:val="28"/>
+        </w:rPr>
+        <w:t>)</w:t>
+      </w:r>
       <w:r>
         <w:rPr>
           <w:rFonts w:ascii="Times New Roman" w:hAnsi="Times New Roman" w:cs="Times New Roman"/>
@@ -2793,23 +2570,19 @@
         </w:rPr>
         <w:t xml:space="preserve"> от промежуточного маршрутизатора</w:t>
       </w:r>
-    </w:p>
-    <w:p>
-      <w:pPr>
-        <w:spacing w:after="0"/>
-        <w:jc w:val="center"/>
-        <w:rPr>
-          <w:rFonts w:ascii="Times New Roman" w:hAnsi="Times New Roman" w:cs="Times New Roman"/>
-          <w:sz w:val="28"/>
-          <w:szCs w:val="28"/>
-        </w:rPr>
-      </w:pPr>
-      <w:r>
-        <w:rPr>
-          <w:rFonts w:ascii="Times New Roman" w:hAnsi="Times New Roman" w:cs="Times New Roman"/>
-          <w:sz w:val="28"/>
-          <w:szCs w:val="28"/>
-          <w:lang w:val="en-US"/>
+      <w:r>
+        <w:rPr>
+          <w:rFonts w:ascii="Times New Roman" w:hAnsi="Times New Roman" w:cs="Times New Roman"/>
+          <w:sz w:val="28"/>
+          <w:szCs w:val="28"/>
+        </w:rPr>
+        <w:t xml:space="preserve"> </w:t>
+      </w:r>
+      <w:r>
+        <w:rPr>
+          <w:rFonts w:ascii="Times New Roman" w:hAnsi="Times New Roman" w:cs="Times New Roman"/>
+          <w:sz w:val="28"/>
+          <w:szCs w:val="28"/>
         </w:rPr>
         <w:t>(</w:t>
       </w:r>
@@ -2821,6 +2594,17 @@
         </w:rPr>
         <w:t>системная утилита)</w:t>
       </w:r>
+    </w:p>
+    <w:p>
+      <w:pPr>
+        <w:spacing w:after="0"/>
+        <w:jc w:val="center"/>
+        <w:rPr>
+          <w:rFonts w:ascii="Times New Roman" w:hAnsi="Times New Roman" w:cs="Times New Roman"/>
+          <w:sz w:val="28"/>
+          <w:szCs w:val="28"/>
+        </w:rPr>
+      </w:pPr>
     </w:p>
     <w:p>
       <w:pPr>
@@ -2854,10 +2638,10 @@
         </w:rPr>
         <w:lastRenderedPageBreak/>
         <w:drawing>
-          <wp:inline distT="0" distB="0" distL="0" distR="0" wp14:anchorId="4AC9EE32" wp14:editId="2342C4D0">
-            <wp:extent cx="4916805" cy="2807335"/>
+          <wp:inline distT="0" distB="0" distL="0" distR="0" wp14:anchorId="4E48783E" wp14:editId="4ADAFD28">
+            <wp:extent cx="4747260" cy="2865120"/>
             <wp:effectExtent l="0" t="0" r="0" b="0"/>
-            <wp:docPr id="25" name="Рисунок 25"/>
+            <wp:docPr id="35" name="Рисунок 35"/>
             <wp:cNvGraphicFramePr>
               <a:graphicFrameLocks xmlns:a="http://schemas.openxmlformats.org/drawingml/2006/main" noChangeAspect="1"/>
             </wp:cNvGraphicFramePr>
@@ -2865,7 +2649,7 @@
               <a:graphicData uri="http://schemas.openxmlformats.org/drawingml/2006/picture">
                 <pic:pic xmlns:pic="http://schemas.openxmlformats.org/drawingml/2006/picture">
                   <pic:nvPicPr>
-                    <pic:cNvPr id="0" name="Picture 17"/>
+                    <pic:cNvPr id="0" name="Picture 22"/>
                     <pic:cNvPicPr>
                       <a:picLocks noChangeAspect="1" noChangeArrowheads="1"/>
                     </pic:cNvPicPr>
@@ -2886,7 +2670,7 @@
                   <pic:spPr bwMode="auto">
                     <a:xfrm>
                       <a:off x="0" y="0"/>
-                      <a:ext cx="4916805" cy="2807335"/>
+                      <a:ext cx="4747260" cy="2865120"/>
                     </a:xfrm>
                     <a:prstGeom prst="rect">
                       <a:avLst/>
@@ -2950,7 +2734,25 @@
           <w:sz w:val="28"/>
           <w:szCs w:val="28"/>
         </w:rPr>
-        <w:t>10</w:t>
+        <w:t xml:space="preserve">10 </w:t>
+      </w:r>
+      <w:r>
+        <w:rPr>
+          <w:rFonts w:ascii="Times New Roman" w:hAnsi="Times New Roman" w:cs="Times New Roman"/>
+          <w:noProof/>
+          <w:sz w:val="28"/>
+          <w:szCs w:val="28"/>
+        </w:rPr>
+        <w:t>–</w:t>
+      </w:r>
+      <w:r>
+        <w:rPr>
+          <w:rFonts w:ascii="Times New Roman" w:hAnsi="Times New Roman" w:cs="Times New Roman"/>
+          <w:noProof/>
+          <w:sz w:val="28"/>
+          <w:szCs w:val="28"/>
+        </w:rPr>
+        <w:t xml:space="preserve"> структура</w:t>
       </w:r>
       <w:r>
         <w:rPr>
@@ -2964,16 +2766,22 @@
       <w:r>
         <w:rPr>
           <w:rFonts w:ascii="Times New Roman" w:hAnsi="Times New Roman" w:cs="Times New Roman"/>
-          <w:noProof/>
-          <w:sz w:val="28"/>
-          <w:szCs w:val="28"/>
-        </w:rPr>
-        <w:t>–</w:t>
-      </w:r>
-      <w:r>
-        <w:rPr>
-          <w:rFonts w:ascii="Times New Roman" w:hAnsi="Times New Roman" w:cs="Times New Roman"/>
-          <w:noProof/>
+          <w:sz w:val="28"/>
+          <w:szCs w:val="28"/>
+        </w:rPr>
+        <w:t>ICMP</w:t>
+      </w:r>
+      <w:r>
+        <w:rPr>
+          <w:rFonts w:ascii="Times New Roman" w:hAnsi="Times New Roman" w:cs="Times New Roman"/>
+          <w:sz w:val="28"/>
+          <w:szCs w:val="28"/>
+        </w:rPr>
+        <w:t>-пакета</w:t>
+      </w:r>
+      <w:r>
+        <w:rPr>
+          <w:rFonts w:ascii="Times New Roman" w:hAnsi="Times New Roman" w:cs="Times New Roman"/>
           <w:sz w:val="28"/>
           <w:szCs w:val="28"/>
         </w:rPr>
@@ -2985,18 +2793,24 @@
           <w:sz w:val="28"/>
           <w:szCs w:val="28"/>
         </w:rPr>
-        <w:t xml:space="preserve">ICMP Time </w:t>
-      </w:r>
-      <w:proofErr w:type="spellStart"/>
-      <w:r>
-        <w:rPr>
-          <w:rFonts w:ascii="Times New Roman" w:hAnsi="Times New Roman" w:cs="Times New Roman"/>
-          <w:sz w:val="28"/>
-          <w:szCs w:val="28"/>
-        </w:rPr>
-        <w:t>Exceeded</w:t>
-      </w:r>
-      <w:proofErr w:type="spellEnd"/>
+        <w:t>(</w:t>
+      </w:r>
+      <w:r>
+        <w:rPr>
+          <w:rFonts w:ascii="Times New Roman" w:hAnsi="Times New Roman" w:cs="Times New Roman"/>
+          <w:sz w:val="28"/>
+          <w:szCs w:val="28"/>
+        </w:rPr>
+        <w:t>Time Exceeded</w:t>
+      </w:r>
+      <w:r>
+        <w:rPr>
+          <w:rFonts w:ascii="Times New Roman" w:hAnsi="Times New Roman" w:cs="Times New Roman"/>
+          <w:sz w:val="28"/>
+          <w:szCs w:val="28"/>
+        </w:rPr>
+        <w:t>)</w:t>
+      </w:r>
       <w:r>
         <w:rPr>
           <w:rFonts w:ascii="Times New Roman" w:hAnsi="Times New Roman" w:cs="Times New Roman"/>
@@ -3005,134 +2819,77 @@
         </w:rPr>
         <w:t xml:space="preserve"> от промежуточного маршрутизатора</w:t>
       </w:r>
-    </w:p>
-    <w:p>
-      <w:pPr>
-        <w:spacing w:after="0"/>
-        <w:jc w:val="center"/>
-        <w:rPr>
-          <w:rFonts w:ascii="Times New Roman" w:hAnsi="Times New Roman" w:cs="Times New Roman"/>
-          <w:sz w:val="28"/>
-          <w:szCs w:val="28"/>
-        </w:rPr>
-      </w:pPr>
-      <w:r>
+      <w:r>
+        <w:rPr>
+          <w:rFonts w:ascii="Times New Roman" w:hAnsi="Times New Roman" w:cs="Times New Roman"/>
+          <w:sz w:val="28"/>
+          <w:szCs w:val="28"/>
+        </w:rPr>
+        <w:t xml:space="preserve"> </w:t>
+      </w:r>
+      <w:r>
+        <w:rPr>
+          <w:rFonts w:ascii="Times New Roman" w:hAnsi="Times New Roman" w:cs="Times New Roman"/>
+          <w:sz w:val="28"/>
+          <w:szCs w:val="28"/>
+        </w:rPr>
+        <w:t>(</w:t>
+      </w:r>
+      <w:r>
+        <w:rPr>
+          <w:rFonts w:ascii="Times New Roman" w:hAnsi="Times New Roman" w:cs="Times New Roman"/>
+          <w:sz w:val="28"/>
+          <w:szCs w:val="28"/>
+        </w:rPr>
+        <w:t>разработанная утилита)</w:t>
+      </w:r>
+    </w:p>
+    <w:p>
+      <w:pPr>
+        <w:spacing w:after="0"/>
+        <w:jc w:val="center"/>
+        <w:rPr>
+          <w:rFonts w:ascii="Times New Roman" w:hAnsi="Times New Roman" w:cs="Times New Roman"/>
+          <w:sz w:val="28"/>
+          <w:szCs w:val="28"/>
+        </w:rPr>
+      </w:pPr>
+    </w:p>
+    <w:p>
+      <w:pPr>
+        <w:spacing w:after="0"/>
+        <w:jc w:val="center"/>
+        <w:rPr>
+          <w:rFonts w:ascii="Times New Roman" w:hAnsi="Times New Roman" w:cs="Times New Roman"/>
+          <w:sz w:val="28"/>
+          <w:szCs w:val="28"/>
+        </w:rPr>
+      </w:pPr>
+    </w:p>
+    <w:p>
+      <w:pPr>
+        <w:spacing w:after="0"/>
+        <w:jc w:val="center"/>
         <w:rPr>
           <w:rFonts w:ascii="Times New Roman" w:hAnsi="Times New Roman" w:cs="Times New Roman"/>
           <w:sz w:val="28"/>
           <w:szCs w:val="28"/>
           <w:lang w:val="en-US"/>
         </w:rPr>
-        <w:t>(</w:t>
-      </w:r>
-      <w:r>
-        <w:rPr>
-          <w:rFonts w:ascii="Times New Roman" w:hAnsi="Times New Roman" w:cs="Times New Roman"/>
-          <w:sz w:val="28"/>
-          <w:szCs w:val="28"/>
-        </w:rPr>
-        <w:t>разработанная</w:t>
-      </w:r>
-      <w:r>
-        <w:rPr>
-          <w:rFonts w:ascii="Times New Roman" w:hAnsi="Times New Roman" w:cs="Times New Roman"/>
-          <w:sz w:val="28"/>
-          <w:szCs w:val="28"/>
-        </w:rPr>
-        <w:t xml:space="preserve"> утилита)</w:t>
-      </w:r>
-    </w:p>
-    <w:p>
-      <w:pPr>
-        <w:spacing w:after="0"/>
-        <w:jc w:val="center"/>
-        <w:rPr>
-          <w:rFonts w:ascii="Times New Roman" w:hAnsi="Times New Roman" w:cs="Times New Roman"/>
-          <w:sz w:val="28"/>
-          <w:szCs w:val="28"/>
-        </w:rPr>
-      </w:pPr>
-    </w:p>
-    <w:p>
-      <w:pPr>
-        <w:spacing w:after="0"/>
-        <w:jc w:val="center"/>
-        <w:rPr>
-          <w:rFonts w:ascii="Times New Roman" w:hAnsi="Times New Roman" w:cs="Times New Roman"/>
-          <w:sz w:val="28"/>
-          <w:szCs w:val="28"/>
-        </w:rPr>
-      </w:pPr>
-    </w:p>
-    <w:p>
-      <w:pPr>
-        <w:spacing w:after="0"/>
-        <w:jc w:val="center"/>
-        <w:rPr>
-          <w:rFonts w:ascii="Times New Roman" w:hAnsi="Times New Roman" w:cs="Times New Roman"/>
-          <w:sz w:val="28"/>
-          <w:szCs w:val="28"/>
-        </w:rPr>
-      </w:pPr>
-    </w:p>
-    <w:p>
-      <w:pPr>
-        <w:spacing w:after="0"/>
-        <w:jc w:val="center"/>
-        <w:rPr>
-          <w:rFonts w:ascii="Times New Roman" w:hAnsi="Times New Roman" w:cs="Times New Roman"/>
-          <w:sz w:val="28"/>
-          <w:szCs w:val="28"/>
-        </w:rPr>
-      </w:pPr>
-    </w:p>
-    <w:p>
-      <w:pPr>
-        <w:spacing w:after="0"/>
-        <w:jc w:val="center"/>
-        <w:rPr>
-          <w:rFonts w:ascii="Times New Roman" w:hAnsi="Times New Roman" w:cs="Times New Roman"/>
-          <w:sz w:val="28"/>
-          <w:szCs w:val="28"/>
-        </w:rPr>
-      </w:pPr>
-    </w:p>
-    <w:p>
-      <w:pPr>
-        <w:spacing w:after="0"/>
-        <w:jc w:val="center"/>
-        <w:rPr>
-          <w:rFonts w:ascii="Times New Roman" w:hAnsi="Times New Roman" w:cs="Times New Roman"/>
+      </w:pPr>
+      <w:r>
+        <w:rPr>
+          <w:rFonts w:ascii="Times New Roman" w:hAnsi="Times New Roman" w:cs="Times New Roman"/>
+          <w:noProof/>
           <w:sz w:val="28"/>
           <w:szCs w:val="28"/>
           <w:lang w:val="en-US"/>
         </w:rPr>
-      </w:pPr>
-    </w:p>
-    <w:p>
-      <w:pPr>
-        <w:spacing w:after="0"/>
-        <w:jc w:val="center"/>
-        <w:rPr>
-          <w:rFonts w:ascii="Times New Roman" w:hAnsi="Times New Roman" w:cs="Times New Roman"/>
-          <w:sz w:val="28"/>
-          <w:szCs w:val="28"/>
-          <w:lang w:val="en-US"/>
-        </w:rPr>
-      </w:pPr>
-      <w:r>
-        <w:rPr>
-          <w:rFonts w:ascii="Times New Roman" w:hAnsi="Times New Roman" w:cs="Times New Roman"/>
-          <w:noProof/>
-          <w:sz w:val="28"/>
-          <w:szCs w:val="28"/>
-          <w:lang w:val="en-US"/>
-        </w:rPr>
         <w:drawing>
-          <wp:inline distT="0" distB="0" distL="0" distR="0" wp14:anchorId="26E3178B" wp14:editId="35D92E44">
-            <wp:extent cx="3206249" cy="2245895"/>
-            <wp:effectExtent l="0" t="0" r="0" b="2540"/>
-            <wp:docPr id="30" name="Рисунок 30"/>
+          <wp:inline distT="0" distB="0" distL="0" distR="0" wp14:anchorId="31AB169C" wp14:editId="33A7F7CD">
+            <wp:extent cx="3733800" cy="3307080"/>
+            <wp:effectExtent l="0" t="0" r="0" b="7620"/>
+            <wp:docPr id="17" name="Рисунок 17"/>
             <wp:cNvGraphicFramePr>
               <a:graphicFrameLocks xmlns:a="http://schemas.openxmlformats.org/drawingml/2006/main" noChangeAspect="1"/>
             </wp:cNvGraphicFramePr>
@@ -3140,7 +2897,7 @@
               <a:graphicData uri="http://schemas.openxmlformats.org/drawingml/2006/picture">
                 <pic:pic xmlns:pic="http://schemas.openxmlformats.org/drawingml/2006/picture">
                   <pic:nvPicPr>
-                    <pic:cNvPr id="0" name="Picture 22"/>
+                    <pic:cNvPr id="0" name="Picture 11"/>
                     <pic:cNvPicPr>
                       <a:picLocks noChangeAspect="1" noChangeArrowheads="1"/>
                     </pic:cNvPicPr>
@@ -3161,7 +2918,7 @@
                   <pic:spPr bwMode="auto">
                     <a:xfrm>
                       <a:off x="0" y="0"/>
-                      <a:ext cx="3209038" cy="2247848"/>
+                      <a:ext cx="3733800" cy="3307080"/>
                     </a:xfrm>
                     <a:prstGeom prst="rect">
                       <a:avLst/>
@@ -3265,129 +3022,63 @@
     <w:p>
       <w:pPr>
         <w:spacing w:after="0"/>
-        <w:jc w:val="center"/>
-        <w:rPr>
-          <w:rFonts w:ascii="Times New Roman" w:hAnsi="Times New Roman" w:cs="Times New Roman"/>
-          <w:noProof/>
-          <w:sz w:val="28"/>
-          <w:szCs w:val="28"/>
-        </w:rPr>
-      </w:pPr>
-    </w:p>
-    <w:p>
-      <w:pPr>
-        <w:spacing w:after="0"/>
-        <w:jc w:val="center"/>
-        <w:rPr>
-          <w:rFonts w:ascii="Times New Roman" w:hAnsi="Times New Roman" w:cs="Times New Roman"/>
-          <w:noProof/>
-          <w:sz w:val="28"/>
-          <w:szCs w:val="28"/>
-        </w:rPr>
-      </w:pPr>
-    </w:p>
-    <w:p>
-      <w:pPr>
-        <w:spacing w:after="0"/>
-        <w:jc w:val="center"/>
-        <w:rPr>
-          <w:rFonts w:ascii="Times New Roman" w:hAnsi="Times New Roman" w:cs="Times New Roman"/>
-          <w:noProof/>
-          <w:sz w:val="28"/>
-          <w:szCs w:val="28"/>
-        </w:rPr>
-      </w:pPr>
-    </w:p>
-    <w:p>
-      <w:pPr>
-        <w:spacing w:after="0"/>
-        <w:jc w:val="center"/>
-        <w:rPr>
-          <w:rFonts w:ascii="Times New Roman" w:hAnsi="Times New Roman" w:cs="Times New Roman"/>
-          <w:noProof/>
-          <w:sz w:val="28"/>
-          <w:szCs w:val="28"/>
-        </w:rPr>
-      </w:pPr>
-    </w:p>
-    <w:p>
-      <w:pPr>
-        <w:spacing w:after="0"/>
-        <w:jc w:val="center"/>
-        <w:rPr>
-          <w:rFonts w:ascii="Times New Roman" w:hAnsi="Times New Roman" w:cs="Times New Roman"/>
-          <w:noProof/>
-          <w:sz w:val="28"/>
-          <w:szCs w:val="28"/>
-        </w:rPr>
-      </w:pPr>
-    </w:p>
-    <w:p>
-      <w:pPr>
-        <w:spacing w:after="0"/>
-        <w:jc w:val="center"/>
-        <w:rPr>
-          <w:rFonts w:ascii="Times New Roman" w:hAnsi="Times New Roman" w:cs="Times New Roman"/>
-          <w:noProof/>
-          <w:sz w:val="28"/>
-          <w:szCs w:val="28"/>
-        </w:rPr>
-      </w:pPr>
-    </w:p>
-    <w:p>
-      <w:pPr>
-        <w:spacing w:after="0"/>
-        <w:rPr>
-          <w:rFonts w:ascii="Times New Roman" w:hAnsi="Times New Roman" w:cs="Times New Roman"/>
-          <w:noProof/>
-          <w:sz w:val="28"/>
-          <w:szCs w:val="28"/>
-        </w:rPr>
-      </w:pPr>
-    </w:p>
-    <w:p>
-      <w:pPr>
-        <w:spacing w:after="0"/>
-        <w:jc w:val="center"/>
-        <w:rPr>
-          <w:rFonts w:ascii="Times New Roman" w:hAnsi="Times New Roman" w:cs="Times New Roman"/>
-          <w:noProof/>
-          <w:sz w:val="28"/>
-          <w:szCs w:val="28"/>
-        </w:rPr>
-      </w:pPr>
-    </w:p>
-    <w:p>
-      <w:pPr>
-        <w:spacing w:after="0"/>
-        <w:jc w:val="center"/>
-        <w:rPr>
-          <w:rFonts w:ascii="Times New Roman" w:hAnsi="Times New Roman" w:cs="Times New Roman"/>
-          <w:noProof/>
-          <w:sz w:val="28"/>
-          <w:szCs w:val="28"/>
-        </w:rPr>
-      </w:pPr>
-      <w:r>
-        <w:rPr>
-          <w:rFonts w:ascii="Times New Roman" w:hAnsi="Times New Roman" w:cs="Times New Roman"/>
-          <w:noProof/>
-          <w:sz w:val="28"/>
-          <w:szCs w:val="28"/>
-        </w:rPr>
+        <w:rPr>
+          <w:rFonts w:ascii="Times New Roman" w:hAnsi="Times New Roman" w:cs="Times New Roman"/>
+          <w:noProof/>
+          <w:sz w:val="28"/>
+          <w:szCs w:val="28"/>
+        </w:rPr>
+      </w:pPr>
+    </w:p>
+    <w:p>
+      <w:pPr>
+        <w:spacing w:after="0"/>
+        <w:jc w:val="center"/>
+        <w:rPr>
+          <w:rFonts w:ascii="Times New Roman" w:hAnsi="Times New Roman" w:cs="Times New Roman"/>
+          <w:noProof/>
+          <w:sz w:val="28"/>
+          <w:szCs w:val="28"/>
+        </w:rPr>
+      </w:pPr>
+    </w:p>
+    <w:p>
+      <w:pPr>
+        <w:spacing w:after="0"/>
+        <w:jc w:val="center"/>
+        <w:rPr>
+          <w:rFonts w:ascii="Times New Roman" w:hAnsi="Times New Roman" w:cs="Times New Roman"/>
+          <w:noProof/>
+          <w:sz w:val="28"/>
+          <w:szCs w:val="28"/>
+        </w:rPr>
+      </w:pPr>
+    </w:p>
+    <w:p>
+      <w:pPr>
+        <w:spacing w:after="0"/>
+        <w:jc w:val="center"/>
+        <w:rPr>
+          <w:rFonts w:ascii="Times New Roman" w:hAnsi="Times New Roman" w:cs="Times New Roman"/>
+          <w:noProof/>
+          <w:sz w:val="28"/>
+          <w:szCs w:val="28"/>
+        </w:rPr>
+      </w:pPr>
+      <w:r>
+        <w:rPr>
+          <w:rFonts w:ascii="Times New Roman" w:hAnsi="Times New Roman" w:cs="Times New Roman"/>
+          <w:noProof/>
+          <w:sz w:val="28"/>
+          <w:szCs w:val="28"/>
+          <w:lang w:val="en-US"/>
+        </w:rPr>
+        <w:lastRenderedPageBreak/>
         <w:drawing>
-          <wp:anchor distT="0" distB="0" distL="114300" distR="114300" simplePos="0" relativeHeight="251658240" behindDoc="0" locked="0" layoutInCell="1" allowOverlap="1" wp14:anchorId="50595E79" wp14:editId="2C50585B">
-            <wp:simplePos x="0" y="0"/>
-            <wp:positionH relativeFrom="margin">
-              <wp:align>center</wp:align>
-            </wp:positionH>
-            <wp:positionV relativeFrom="paragraph">
-              <wp:posOffset>-100</wp:posOffset>
-            </wp:positionV>
-            <wp:extent cx="4467225" cy="2398395"/>
-            <wp:effectExtent l="0" t="0" r="9525" b="1905"/>
-            <wp:wrapSquare wrapText="bothSides"/>
-            <wp:docPr id="31" name="Рисунок 31"/>
+          <wp:inline distT="0" distB="0" distL="0" distR="0" wp14:anchorId="1875AB1C" wp14:editId="5E45EFE8">
+            <wp:extent cx="4968240" cy="2962384"/>
+            <wp:effectExtent l="0" t="0" r="3810" b="9525"/>
+            <wp:docPr id="16" name="Рисунок 16"/>
             <wp:cNvGraphicFramePr>
               <a:graphicFrameLocks xmlns:a="http://schemas.openxmlformats.org/drawingml/2006/main" noChangeAspect="1"/>
             </wp:cNvGraphicFramePr>
@@ -3395,7 +3086,7 @@
               <a:graphicData uri="http://schemas.openxmlformats.org/drawingml/2006/picture">
                 <pic:pic xmlns:pic="http://schemas.openxmlformats.org/drawingml/2006/picture">
                   <pic:nvPicPr>
-                    <pic:cNvPr id="0" name="Picture 23"/>
+                    <pic:cNvPr id="0" name="Picture 10"/>
                     <pic:cNvPicPr>
                       <a:picLocks noChangeAspect="1" noChangeArrowheads="1"/>
                     </pic:cNvPicPr>
@@ -3416,7 +3107,7 @@
                   <pic:spPr bwMode="auto">
                     <a:xfrm>
                       <a:off x="0" y="0"/>
-                      <a:ext cx="4467225" cy="2398395"/>
+                      <a:ext cx="4971665" cy="2964426"/>
                     </a:xfrm>
                     <a:prstGeom prst="rect">
                       <a:avLst/>
@@ -3429,144 +3120,9 @@
                 </pic:pic>
               </a:graphicData>
             </a:graphic>
-            <wp14:sizeRelH relativeFrom="margin">
-              <wp14:pctWidth>0</wp14:pctWidth>
-            </wp14:sizeRelH>
-            <wp14:sizeRelV relativeFrom="margin">
-              <wp14:pctHeight>0</wp14:pctHeight>
-            </wp14:sizeRelV>
-          </wp:anchor>
+          </wp:inline>
         </w:drawing>
       </w:r>
-      <w:r>
-        <w:rPr>
-          <w:rFonts w:ascii="Times New Roman" w:hAnsi="Times New Roman" w:cs="Times New Roman"/>
-          <w:noProof/>
-          <w:sz w:val="28"/>
-          <w:szCs w:val="28"/>
-        </w:rPr>
-        <w:t xml:space="preserve"> </w:t>
-      </w:r>
-    </w:p>
-    <w:p>
-      <w:pPr>
-        <w:spacing w:after="0"/>
-        <w:jc w:val="center"/>
-        <w:rPr>
-          <w:rFonts w:ascii="Times New Roman" w:hAnsi="Times New Roman" w:cs="Times New Roman"/>
-          <w:noProof/>
-          <w:sz w:val="28"/>
-          <w:szCs w:val="28"/>
-        </w:rPr>
-      </w:pPr>
-    </w:p>
-    <w:p>
-      <w:pPr>
-        <w:spacing w:after="0"/>
-        <w:jc w:val="center"/>
-        <w:rPr>
-          <w:rFonts w:ascii="Times New Roman" w:hAnsi="Times New Roman" w:cs="Times New Roman"/>
-          <w:noProof/>
-          <w:sz w:val="28"/>
-          <w:szCs w:val="28"/>
-        </w:rPr>
-      </w:pPr>
-    </w:p>
-    <w:p>
-      <w:pPr>
-        <w:spacing w:after="0"/>
-        <w:jc w:val="center"/>
-        <w:rPr>
-          <w:rFonts w:ascii="Times New Roman" w:hAnsi="Times New Roman" w:cs="Times New Roman"/>
-          <w:noProof/>
-          <w:sz w:val="28"/>
-          <w:szCs w:val="28"/>
-        </w:rPr>
-      </w:pPr>
-    </w:p>
-    <w:p>
-      <w:pPr>
-        <w:spacing w:after="0"/>
-        <w:jc w:val="center"/>
-        <w:rPr>
-          <w:rFonts w:ascii="Times New Roman" w:hAnsi="Times New Roman" w:cs="Times New Roman"/>
-          <w:noProof/>
-          <w:sz w:val="28"/>
-          <w:szCs w:val="28"/>
-        </w:rPr>
-      </w:pPr>
-    </w:p>
-    <w:p>
-      <w:pPr>
-        <w:spacing w:after="0"/>
-        <w:jc w:val="center"/>
-        <w:rPr>
-          <w:rFonts w:ascii="Times New Roman" w:hAnsi="Times New Roman" w:cs="Times New Roman"/>
-          <w:noProof/>
-          <w:sz w:val="28"/>
-          <w:szCs w:val="28"/>
-        </w:rPr>
-      </w:pPr>
-    </w:p>
-    <w:p>
-      <w:pPr>
-        <w:spacing w:after="0"/>
-        <w:jc w:val="center"/>
-        <w:rPr>
-          <w:rFonts w:ascii="Times New Roman" w:hAnsi="Times New Roman" w:cs="Times New Roman"/>
-          <w:noProof/>
-          <w:sz w:val="28"/>
-          <w:szCs w:val="28"/>
-        </w:rPr>
-      </w:pPr>
-    </w:p>
-    <w:p>
-      <w:pPr>
-        <w:spacing w:after="0"/>
-        <w:jc w:val="center"/>
-        <w:rPr>
-          <w:rFonts w:ascii="Times New Roman" w:hAnsi="Times New Roman" w:cs="Times New Roman"/>
-          <w:noProof/>
-          <w:sz w:val="28"/>
-          <w:szCs w:val="28"/>
-        </w:rPr>
-      </w:pPr>
-    </w:p>
-    <w:p>
-      <w:pPr>
-        <w:spacing w:after="0"/>
-        <w:jc w:val="center"/>
-        <w:rPr>
-          <w:rFonts w:ascii="Times New Roman" w:hAnsi="Times New Roman" w:cs="Times New Roman"/>
-          <w:noProof/>
-          <w:sz w:val="28"/>
-          <w:szCs w:val="28"/>
-        </w:rPr>
-      </w:pPr>
-    </w:p>
-    <w:p>
-      <w:pPr>
-        <w:spacing w:after="0"/>
-        <w:jc w:val="center"/>
-        <w:rPr>
-          <w:rFonts w:ascii="Times New Roman" w:hAnsi="Times New Roman" w:cs="Times New Roman"/>
-          <w:noProof/>
-          <w:sz w:val="28"/>
-          <w:szCs w:val="28"/>
-        </w:rPr>
-      </w:pPr>
-    </w:p>
-    <w:p>
-      <w:pPr>
-        <w:spacing w:after="0"/>
-        <w:jc w:val="center"/>
-        <w:rPr>
-          <w:rFonts w:ascii="Times New Roman" w:hAnsi="Times New Roman" w:cs="Times New Roman"/>
-          <w:noProof/>
-          <w:sz w:val="28"/>
-          <w:szCs w:val="28"/>
-        </w:rPr>
-      </w:pPr>
     </w:p>
     <w:p>
       <w:pPr>
@@ -3630,16 +3186,7 @@
           <w:sz w:val="28"/>
           <w:szCs w:val="28"/>
         </w:rPr>
-        <w:t xml:space="preserve"> </w:t>
-      </w:r>
-      <w:r>
-        <w:rPr>
-          <w:rFonts w:ascii="Times New Roman" w:hAnsi="Times New Roman" w:cs="Times New Roman"/>
-          <w:noProof/>
-          <w:sz w:val="28"/>
-          <w:szCs w:val="28"/>
-        </w:rPr>
-        <w:t>Р</w:t>
+        <w:t xml:space="preserve"> Р</w:t>
       </w:r>
       <w:r>
         <w:rPr>

</xml_diff>

<commit_message>
big little indian bug fixed
</commit_message>
<xml_diff>
--- a/MyTracert/LR2_jalilova.docx
+++ b/MyTracert/LR2_jalilova.docx
@@ -12,6 +12,8 @@
           <w:szCs w:val="28"/>
         </w:rPr>
       </w:pPr>
+      <w:bookmarkStart w:id="0" w:name="_Hlk223883930"/>
+      <w:bookmarkEnd w:id="0"/>
       <w:r>
         <w:rPr>
           <w:rFonts w:ascii="Times New Roman" w:hAnsi="Times New Roman" w:cs="Times New Roman"/>
@@ -2015,10 +2017,10 @@
           <w:szCs w:val="28"/>
         </w:rPr>
         <w:drawing>
-          <wp:inline distT="0" distB="0" distL="0" distR="0" wp14:anchorId="1271D8FF" wp14:editId="2B627FA7">
-            <wp:extent cx="3037828" cy="1714500"/>
-            <wp:effectExtent l="0" t="0" r="0" b="0"/>
-            <wp:docPr id="33" name="Рисунок 33"/>
+          <wp:inline distT="0" distB="0" distL="0" distR="0" wp14:anchorId="2114D388" wp14:editId="60DCC37F">
+            <wp:extent cx="3295596" cy="1859280"/>
+            <wp:effectExtent l="0" t="0" r="635" b="7620"/>
+            <wp:docPr id="5" name="Рисунок 5"/>
             <wp:cNvGraphicFramePr>
               <a:graphicFrameLocks xmlns:a="http://schemas.openxmlformats.org/drawingml/2006/main" noChangeAspect="1"/>
             </wp:cNvGraphicFramePr>
@@ -2026,7 +2028,7 @@
               <a:graphicData uri="http://schemas.openxmlformats.org/drawingml/2006/picture">
                 <pic:pic xmlns:pic="http://schemas.openxmlformats.org/drawingml/2006/picture">
                   <pic:nvPicPr>
-                    <pic:cNvPr id="0" name="Picture 20"/>
+                    <pic:cNvPr id="0" name="Picture 5"/>
                     <pic:cNvPicPr>
                       <a:picLocks noChangeAspect="1" noChangeArrowheads="1"/>
                     </pic:cNvPicPr>
@@ -2047,7 +2049,7 @@
                   <pic:spPr bwMode="auto">
                     <a:xfrm>
                       <a:off x="0" y="0"/>
-                      <a:ext cx="3040023" cy="1715739"/>
+                      <a:ext cx="3298041" cy="1860660"/>
                     </a:xfrm>
                     <a:prstGeom prst="rect">
                       <a:avLst/>
@@ -2190,10 +2192,10 @@
         </w:rPr>
         <w:lastRenderedPageBreak/>
         <w:drawing>
-          <wp:inline distT="0" distB="0" distL="0" distR="0" wp14:anchorId="478957E6" wp14:editId="29DAC935">
-            <wp:extent cx="2674620" cy="1653540"/>
-            <wp:effectExtent l="0" t="0" r="0" b="3810"/>
-            <wp:docPr id="34" name="Рисунок 34"/>
+          <wp:inline distT="0" distB="0" distL="0" distR="0" wp14:anchorId="6F2500F4" wp14:editId="61317558">
+            <wp:extent cx="3116580" cy="1724792"/>
+            <wp:effectExtent l="0" t="0" r="7620" b="8890"/>
+            <wp:docPr id="4" name="Рисунок 4"/>
             <wp:cNvGraphicFramePr>
               <a:graphicFrameLocks xmlns:a="http://schemas.openxmlformats.org/drawingml/2006/main" noChangeAspect="1"/>
             </wp:cNvGraphicFramePr>
@@ -2201,7 +2203,7 @@
               <a:graphicData uri="http://schemas.openxmlformats.org/drawingml/2006/picture">
                 <pic:pic xmlns:pic="http://schemas.openxmlformats.org/drawingml/2006/picture">
                   <pic:nvPicPr>
-                    <pic:cNvPr id="0" name="Picture 21"/>
+                    <pic:cNvPr id="0" name="Picture 4"/>
                     <pic:cNvPicPr>
                       <a:picLocks noChangeAspect="1" noChangeArrowheads="1"/>
                     </pic:cNvPicPr>
@@ -2222,7 +2224,7 @@
                   <pic:spPr bwMode="auto">
                     <a:xfrm>
                       <a:off x="0" y="0"/>
-                      <a:ext cx="2674620" cy="1653540"/>
+                      <a:ext cx="3119377" cy="1726340"/>
                     </a:xfrm>
                     <a:prstGeom prst="rect">
                       <a:avLst/>
@@ -2368,38 +2370,37 @@
     <w:p>
       <w:pPr>
         <w:spacing w:after="0"/>
-        <w:jc w:val="center"/>
-        <w:rPr>
-          <w:rFonts w:ascii="Times New Roman" w:hAnsi="Times New Roman" w:cs="Times New Roman"/>
-          <w:sz w:val="28"/>
-          <w:szCs w:val="28"/>
-        </w:rPr>
-      </w:pPr>
-    </w:p>
-    <w:p>
-      <w:pPr>
-        <w:spacing w:after="0"/>
-        <w:jc w:val="center"/>
-        <w:rPr>
-          <w:rFonts w:ascii="Times New Roman" w:hAnsi="Times New Roman" w:cs="Times New Roman"/>
-          <w:sz w:val="28"/>
-          <w:szCs w:val="28"/>
-          <w:lang w:val="en-US"/>
-        </w:rPr>
-      </w:pPr>
-      <w:r>
-        <w:rPr>
-          <w:rFonts w:ascii="Times New Roman" w:hAnsi="Times New Roman" w:cs="Times New Roman"/>
-          <w:noProof/>
-          <w:sz w:val="28"/>
-          <w:szCs w:val="28"/>
-          <w:lang w:val="en-US"/>
+        <w:rPr>
+          <w:rFonts w:ascii="Times New Roman" w:hAnsi="Times New Roman" w:cs="Times New Roman"/>
+          <w:noProof/>
+          <w:sz w:val="28"/>
+          <w:szCs w:val="28"/>
+        </w:rPr>
+      </w:pPr>
+    </w:p>
+    <w:p>
+      <w:pPr>
+        <w:spacing w:after="0"/>
+        <w:jc w:val="center"/>
+        <w:rPr>
+          <w:rFonts w:ascii="Times New Roman" w:hAnsi="Times New Roman" w:cs="Times New Roman"/>
+          <w:noProof/>
+          <w:sz w:val="28"/>
+          <w:szCs w:val="28"/>
+        </w:rPr>
+      </w:pPr>
+      <w:r>
+        <w:rPr>
+          <w:rFonts w:ascii="Times New Roman" w:hAnsi="Times New Roman" w:cs="Times New Roman"/>
+          <w:noProof/>
+          <w:sz w:val="28"/>
+          <w:szCs w:val="28"/>
         </w:rPr>
         <w:drawing>
-          <wp:inline distT="0" distB="0" distL="0" distR="0" wp14:anchorId="35B11B7A" wp14:editId="28E4C16C">
-            <wp:extent cx="4846320" cy="2834640"/>
-            <wp:effectExtent l="0" t="0" r="0" b="3810"/>
-            <wp:docPr id="28" name="Рисунок 28"/>
+          <wp:inline distT="0" distB="0" distL="0" distR="0" wp14:anchorId="3B14BD80" wp14:editId="0B3439BB">
+            <wp:extent cx="2903220" cy="1623060"/>
+            <wp:effectExtent l="0" t="0" r="0" b="0"/>
+            <wp:docPr id="1" name="Рисунок 1"/>
             <wp:cNvGraphicFramePr>
               <a:graphicFrameLocks xmlns:a="http://schemas.openxmlformats.org/drawingml/2006/main" noChangeAspect="1"/>
             </wp:cNvGraphicFramePr>
@@ -2407,7 +2408,7 @@
               <a:graphicData uri="http://schemas.openxmlformats.org/drawingml/2006/picture">
                 <pic:pic xmlns:pic="http://schemas.openxmlformats.org/drawingml/2006/picture">
                   <pic:nvPicPr>
-                    <pic:cNvPr id="0" name="Picture 18"/>
+                    <pic:cNvPr id="0" name="Picture 1"/>
                     <pic:cNvPicPr>
                       <a:picLocks noChangeAspect="1" noChangeArrowheads="1"/>
                     </pic:cNvPicPr>
@@ -2428,7 +2429,7 @@
                   <pic:spPr bwMode="auto">
                     <a:xfrm>
                       <a:off x="0" y="0"/>
-                      <a:ext cx="4846320" cy="2834640"/>
+                      <a:ext cx="2903220" cy="1623060"/>
                     </a:xfrm>
                     <a:prstGeom prst="rect">
                       <a:avLst/>
@@ -2451,30 +2452,68 @@
         <w:jc w:val="center"/>
         <w:rPr>
           <w:rFonts w:ascii="Times New Roman" w:hAnsi="Times New Roman" w:cs="Times New Roman"/>
+          <w:noProof/>
+          <w:sz w:val="28"/>
+          <w:szCs w:val="28"/>
+        </w:rPr>
+      </w:pPr>
+    </w:p>
+    <w:p>
+      <w:pPr>
+        <w:spacing w:after="0"/>
+        <w:jc w:val="center"/>
+        <w:rPr>
+          <w:rFonts w:ascii="Times New Roman" w:hAnsi="Times New Roman" w:cs="Times New Roman"/>
+          <w:noProof/>
+          <w:sz w:val="28"/>
+          <w:szCs w:val="28"/>
+        </w:rPr>
+      </w:pPr>
+      <w:r>
+        <w:rPr>
+          <w:rFonts w:ascii="Times New Roman" w:hAnsi="Times New Roman" w:cs="Times New Roman"/>
+          <w:noProof/>
+          <w:sz w:val="28"/>
+          <w:szCs w:val="28"/>
+        </w:rPr>
+        <w:t xml:space="preserve">Рисунок </w:t>
+      </w:r>
+      <w:r>
+        <w:rPr>
+          <w:rFonts w:ascii="Times New Roman" w:hAnsi="Times New Roman" w:cs="Times New Roman"/>
+          <w:noProof/>
+          <w:sz w:val="28"/>
+          <w:szCs w:val="28"/>
+        </w:rPr>
+        <w:t>9</w:t>
+      </w:r>
+      <w:r>
+        <w:rPr>
+          <w:rFonts w:ascii="Times New Roman" w:hAnsi="Times New Roman" w:cs="Times New Roman"/>
+          <w:noProof/>
+          <w:sz w:val="28"/>
+          <w:szCs w:val="28"/>
+        </w:rPr>
+        <w:t xml:space="preserve"> –</w:t>
+      </w:r>
+      <w:r>
+        <w:rPr>
+          <w:rFonts w:ascii="Times New Roman" w:hAnsi="Times New Roman" w:cs="Times New Roman"/>
+          <w:noProof/>
+          <w:sz w:val="28"/>
+          <w:szCs w:val="28"/>
+        </w:rPr>
+        <w:t xml:space="preserve"> </w:t>
+      </w:r>
+      <w:r>
+        <w:rPr>
+          <w:rFonts w:ascii="Times New Roman" w:hAnsi="Times New Roman" w:cs="Times New Roman"/>
+          <w:noProof/>
           <w:sz w:val="28"/>
           <w:szCs w:val="28"/>
           <w:lang w:val="en-US"/>
         </w:rPr>
-      </w:pPr>
-    </w:p>
-    <w:p>
-      <w:pPr>
-        <w:spacing w:after="0"/>
-        <w:jc w:val="center"/>
-        <w:rPr>
-          <w:rFonts w:ascii="Times New Roman" w:hAnsi="Times New Roman" w:cs="Times New Roman"/>
-          <w:sz w:val="28"/>
-          <w:szCs w:val="28"/>
-        </w:rPr>
-      </w:pPr>
-      <w:r>
-        <w:rPr>
-          <w:rFonts w:ascii="Times New Roman" w:hAnsi="Times New Roman" w:cs="Times New Roman"/>
-          <w:noProof/>
-          <w:sz w:val="28"/>
-          <w:szCs w:val="28"/>
-        </w:rPr>
-        <w:t>Рисунок</w:t>
+        <w:t>ICMP</w:t>
       </w:r>
       <w:r>
         <w:rPr>
@@ -2491,8 +2530,9 @@
           <w:noProof/>
           <w:sz w:val="28"/>
           <w:szCs w:val="28"/>
-        </w:rPr>
-        <w:t>9</w:t>
+          <w:lang w:val="en-US"/>
+        </w:rPr>
+        <w:t>Echo</w:t>
       </w:r>
       <w:r>
         <w:rPr>
@@ -2509,8 +2549,9 @@
           <w:noProof/>
           <w:sz w:val="28"/>
           <w:szCs w:val="28"/>
-        </w:rPr>
-        <w:t>–</w:t>
+          <w:lang w:val="en-US"/>
+        </w:rPr>
+        <w:t>Request</w:t>
       </w:r>
       <w:r>
         <w:rPr>
@@ -2528,120 +2569,53 @@
           <w:sz w:val="28"/>
           <w:szCs w:val="28"/>
         </w:rPr>
-        <w:t xml:space="preserve">структура </w:t>
-      </w:r>
-      <w:r>
-        <w:rPr>
-          <w:rFonts w:ascii="Times New Roman" w:hAnsi="Times New Roman" w:cs="Times New Roman"/>
-          <w:sz w:val="28"/>
-          <w:szCs w:val="28"/>
-        </w:rPr>
-        <w:t xml:space="preserve">ICMP </w:t>
-      </w:r>
-      <w:r>
-        <w:rPr>
-          <w:rFonts w:ascii="Times New Roman" w:hAnsi="Times New Roman" w:cs="Times New Roman"/>
-          <w:sz w:val="28"/>
-          <w:szCs w:val="28"/>
-        </w:rPr>
-        <w:t>пакета (</w:t>
-      </w:r>
-      <w:r>
-        <w:rPr>
-          <w:rFonts w:ascii="Times New Roman" w:hAnsi="Times New Roman" w:cs="Times New Roman"/>
-          <w:sz w:val="28"/>
-          <w:szCs w:val="28"/>
-        </w:rPr>
-        <w:t>Time Exceeded</w:t>
-      </w:r>
-      <w:r>
-        <w:rPr>
-          <w:rFonts w:ascii="Times New Roman" w:hAnsi="Times New Roman" w:cs="Times New Roman"/>
-          <w:sz w:val="28"/>
-          <w:szCs w:val="28"/>
-        </w:rPr>
-        <w:t>)</w:t>
-      </w:r>
-      <w:r>
-        <w:rPr>
-          <w:rFonts w:ascii="Times New Roman" w:hAnsi="Times New Roman" w:cs="Times New Roman"/>
-          <w:sz w:val="28"/>
-          <w:szCs w:val="28"/>
-        </w:rPr>
-        <w:t xml:space="preserve"> от промежуточного маршрутизатора</w:t>
-      </w:r>
-      <w:r>
-        <w:rPr>
-          <w:rFonts w:ascii="Times New Roman" w:hAnsi="Times New Roman" w:cs="Times New Roman"/>
-          <w:sz w:val="28"/>
-          <w:szCs w:val="28"/>
-        </w:rPr>
-        <w:t xml:space="preserve"> </w:t>
-      </w:r>
-      <w:r>
-        <w:rPr>
-          <w:rFonts w:ascii="Times New Roman" w:hAnsi="Times New Roman" w:cs="Times New Roman"/>
-          <w:sz w:val="28"/>
-          <w:szCs w:val="28"/>
-        </w:rPr>
-        <w:t>(</w:t>
-      </w:r>
-      <w:r>
-        <w:rPr>
-          <w:rFonts w:ascii="Times New Roman" w:hAnsi="Times New Roman" w:cs="Times New Roman"/>
-          <w:sz w:val="28"/>
-          <w:szCs w:val="28"/>
-        </w:rPr>
-        <w:t>системная утилита)</w:t>
-      </w:r>
-    </w:p>
-    <w:p>
-      <w:pPr>
-        <w:spacing w:after="0"/>
-        <w:jc w:val="center"/>
-        <w:rPr>
-          <w:rFonts w:ascii="Times New Roman" w:hAnsi="Times New Roman" w:cs="Times New Roman"/>
-          <w:sz w:val="28"/>
-          <w:szCs w:val="28"/>
-        </w:rPr>
-      </w:pPr>
-    </w:p>
-    <w:p>
-      <w:pPr>
-        <w:spacing w:after="0"/>
-        <w:jc w:val="center"/>
-        <w:rPr>
-          <w:rFonts w:ascii="Times New Roman" w:hAnsi="Times New Roman" w:cs="Times New Roman"/>
-          <w:sz w:val="28"/>
-          <w:szCs w:val="28"/>
-        </w:rPr>
-      </w:pPr>
-    </w:p>
-    <w:p>
-      <w:pPr>
-        <w:spacing w:after="0"/>
-        <w:jc w:val="center"/>
-        <w:rPr>
-          <w:rFonts w:ascii="Times New Roman" w:hAnsi="Times New Roman" w:cs="Times New Roman"/>
+        <w:t>пакета, дошедшего до промежуточного маршрутизатора (системная</w:t>
+      </w:r>
+      <w:r>
+        <w:rPr>
+          <w:rFonts w:ascii="Times New Roman" w:hAnsi="Times New Roman" w:cs="Times New Roman"/>
+          <w:noProof/>
+          <w:sz w:val="28"/>
+          <w:szCs w:val="28"/>
+        </w:rPr>
+        <w:t xml:space="preserve"> утилита)</w:t>
+      </w:r>
+    </w:p>
+    <w:p>
+      <w:pPr>
+        <w:spacing w:after="0"/>
+        <w:jc w:val="center"/>
+        <w:rPr>
+          <w:rFonts w:ascii="Times New Roman" w:hAnsi="Times New Roman" w:cs="Times New Roman"/>
+          <w:noProof/>
+          <w:sz w:val="28"/>
+          <w:szCs w:val="28"/>
+        </w:rPr>
+      </w:pPr>
+    </w:p>
+    <w:p>
+      <w:pPr>
+        <w:spacing w:after="0"/>
+        <w:jc w:val="center"/>
+        <w:rPr>
+          <w:rFonts w:ascii="Times New Roman" w:hAnsi="Times New Roman" w:cs="Times New Roman"/>
+          <w:sz w:val="28"/>
+          <w:szCs w:val="28"/>
+        </w:rPr>
+      </w:pPr>
+      <w:r>
+        <w:rPr>
+          <w:rFonts w:ascii="Times New Roman" w:hAnsi="Times New Roman" w:cs="Times New Roman"/>
+          <w:noProof/>
           <w:sz w:val="28"/>
           <w:szCs w:val="28"/>
           <w:lang w:val="en-US"/>
         </w:rPr>
-      </w:pPr>
-      <w:r>
-        <w:rPr>
-          <w:rFonts w:ascii="Times New Roman" w:hAnsi="Times New Roman" w:cs="Times New Roman"/>
-          <w:noProof/>
-          <w:sz w:val="28"/>
-          <w:szCs w:val="28"/>
-          <w:lang w:val="en-US"/>
-        </w:rPr>
-        <w:lastRenderedPageBreak/>
         <w:drawing>
-          <wp:inline distT="0" distB="0" distL="0" distR="0" wp14:anchorId="4E48783E" wp14:editId="4ADAFD28">
-            <wp:extent cx="4747260" cy="2865120"/>
-            <wp:effectExtent l="0" t="0" r="0" b="0"/>
-            <wp:docPr id="35" name="Рисунок 35"/>
+          <wp:inline distT="0" distB="0" distL="0" distR="0" wp14:anchorId="10AF166D" wp14:editId="072E6295">
+            <wp:extent cx="3840480" cy="3502363"/>
+            <wp:effectExtent l="0" t="0" r="7620" b="3175"/>
+            <wp:docPr id="2" name="Рисунок 2"/>
             <wp:cNvGraphicFramePr>
               <a:graphicFrameLocks xmlns:a="http://schemas.openxmlformats.org/drawingml/2006/main" noChangeAspect="1"/>
             </wp:cNvGraphicFramePr>
@@ -2649,7 +2623,7 @@
               <a:graphicData uri="http://schemas.openxmlformats.org/drawingml/2006/picture">
                 <pic:pic xmlns:pic="http://schemas.openxmlformats.org/drawingml/2006/picture">
                   <pic:nvPicPr>
-                    <pic:cNvPr id="0" name="Picture 22"/>
+                    <pic:cNvPr id="0" name="Picture 2"/>
                     <pic:cNvPicPr>
                       <a:picLocks noChangeAspect="1" noChangeArrowheads="1"/>
                     </pic:cNvPicPr>
@@ -2670,7 +2644,7 @@
                   <pic:spPr bwMode="auto">
                     <a:xfrm>
                       <a:off x="0" y="0"/>
-                      <a:ext cx="4747260" cy="2865120"/>
+                      <a:ext cx="3882723" cy="3540887"/>
                     </a:xfrm>
                     <a:prstGeom prst="rect">
                       <a:avLst/>
@@ -2690,7 +2664,6 @@
     <w:p>
       <w:pPr>
         <w:spacing w:after="0"/>
-        <w:jc w:val="center"/>
         <w:rPr>
           <w:rFonts w:ascii="Times New Roman" w:hAnsi="Times New Roman" w:cs="Times New Roman"/>
           <w:sz w:val="28"/>
@@ -2734,7 +2707,16 @@
           <w:sz w:val="28"/>
           <w:szCs w:val="28"/>
         </w:rPr>
-        <w:t xml:space="preserve">10 </w:t>
+        <w:t>10</w:t>
+      </w:r>
+      <w:r>
+        <w:rPr>
+          <w:rFonts w:ascii="Times New Roman" w:hAnsi="Times New Roman" w:cs="Times New Roman"/>
+          <w:noProof/>
+          <w:sz w:val="28"/>
+          <w:szCs w:val="28"/>
+        </w:rPr>
+        <w:t xml:space="preserve"> </w:t>
       </w:r>
       <w:r>
         <w:rPr>
@@ -2752,6 +2734,447 @@
           <w:sz w:val="28"/>
           <w:szCs w:val="28"/>
         </w:rPr>
+        <w:t xml:space="preserve"> </w:t>
+      </w:r>
+      <w:r>
+        <w:rPr>
+          <w:rFonts w:ascii="Times New Roman" w:hAnsi="Times New Roman" w:cs="Times New Roman"/>
+          <w:noProof/>
+          <w:sz w:val="28"/>
+          <w:szCs w:val="28"/>
+        </w:rPr>
+        <w:t xml:space="preserve">структура </w:t>
+      </w:r>
+      <w:r>
+        <w:rPr>
+          <w:rFonts w:ascii="Times New Roman" w:hAnsi="Times New Roman" w:cs="Times New Roman"/>
+          <w:sz w:val="28"/>
+          <w:szCs w:val="28"/>
+        </w:rPr>
+        <w:t xml:space="preserve">ICMP </w:t>
+      </w:r>
+      <w:r>
+        <w:rPr>
+          <w:rFonts w:ascii="Times New Roman" w:hAnsi="Times New Roman" w:cs="Times New Roman"/>
+          <w:sz w:val="28"/>
+          <w:szCs w:val="28"/>
+        </w:rPr>
+        <w:t>пакета (</w:t>
+      </w:r>
+      <w:r>
+        <w:rPr>
+          <w:rFonts w:ascii="Times New Roman" w:hAnsi="Times New Roman" w:cs="Times New Roman"/>
+          <w:sz w:val="28"/>
+          <w:szCs w:val="28"/>
+        </w:rPr>
+        <w:t>Time Exceeded</w:t>
+      </w:r>
+      <w:r>
+        <w:rPr>
+          <w:rFonts w:ascii="Times New Roman" w:hAnsi="Times New Roman" w:cs="Times New Roman"/>
+          <w:sz w:val="28"/>
+          <w:szCs w:val="28"/>
+        </w:rPr>
+        <w:t>)</w:t>
+      </w:r>
+      <w:r>
+        <w:rPr>
+          <w:rFonts w:ascii="Times New Roman" w:hAnsi="Times New Roman" w:cs="Times New Roman"/>
+          <w:sz w:val="28"/>
+          <w:szCs w:val="28"/>
+        </w:rPr>
+        <w:t xml:space="preserve"> от промежуточного маршрутизатора</w:t>
+      </w:r>
+      <w:r>
+        <w:rPr>
+          <w:rFonts w:ascii="Times New Roman" w:hAnsi="Times New Roman" w:cs="Times New Roman"/>
+          <w:sz w:val="28"/>
+          <w:szCs w:val="28"/>
+        </w:rPr>
+        <w:t xml:space="preserve"> </w:t>
+      </w:r>
+      <w:r>
+        <w:rPr>
+          <w:rFonts w:ascii="Times New Roman" w:hAnsi="Times New Roman" w:cs="Times New Roman"/>
+          <w:sz w:val="28"/>
+          <w:szCs w:val="28"/>
+        </w:rPr>
+        <w:t>(</w:t>
+      </w:r>
+      <w:r>
+        <w:rPr>
+          <w:rFonts w:ascii="Times New Roman" w:hAnsi="Times New Roman" w:cs="Times New Roman"/>
+          <w:sz w:val="28"/>
+          <w:szCs w:val="28"/>
+        </w:rPr>
+        <w:t>системная утилита)</w:t>
+      </w:r>
+    </w:p>
+    <w:p>
+      <w:pPr>
+        <w:spacing w:after="0"/>
+        <w:jc w:val="center"/>
+        <w:rPr>
+          <w:rFonts w:ascii="Times New Roman" w:hAnsi="Times New Roman" w:cs="Times New Roman"/>
+          <w:sz w:val="28"/>
+          <w:szCs w:val="28"/>
+          <w:lang w:val="en-US"/>
+        </w:rPr>
+      </w:pPr>
+      <w:r>
+        <w:rPr>
+          <w:rFonts w:ascii="Times New Roman" w:hAnsi="Times New Roman" w:cs="Times New Roman"/>
+          <w:noProof/>
+          <w:sz w:val="28"/>
+          <w:szCs w:val="28"/>
+          <w:lang w:val="en-US"/>
+        </w:rPr>
+        <w:lastRenderedPageBreak/>
+        <w:drawing>
+          <wp:inline distT="0" distB="0" distL="0" distR="0" wp14:anchorId="59661FE1" wp14:editId="0904D052">
+            <wp:extent cx="2750820" cy="1607820"/>
+            <wp:effectExtent l="0" t="0" r="0" b="0"/>
+            <wp:docPr id="9" name="Рисунок 9"/>
+            <wp:cNvGraphicFramePr>
+              <a:graphicFrameLocks xmlns:a="http://schemas.openxmlformats.org/drawingml/2006/main" noChangeAspect="1"/>
+            </wp:cNvGraphicFramePr>
+            <a:graphic xmlns:a="http://schemas.openxmlformats.org/drawingml/2006/main">
+              <a:graphicData uri="http://schemas.openxmlformats.org/drawingml/2006/picture">
+                <pic:pic xmlns:pic="http://schemas.openxmlformats.org/drawingml/2006/picture">
+                  <pic:nvPicPr>
+                    <pic:cNvPr id="0" name="Picture 5"/>
+                    <pic:cNvPicPr>
+                      <a:picLocks noChangeAspect="1" noChangeArrowheads="1"/>
+                    </pic:cNvPicPr>
+                  </pic:nvPicPr>
+                  <pic:blipFill>
+                    <a:blip r:embed="rId18">
+                      <a:extLst>
+                        <a:ext uri="{28A0092B-C50C-407E-A947-70E740481C1C}">
+                          <a14:useLocalDpi xmlns:a14="http://schemas.microsoft.com/office/drawing/2010/main" val="0"/>
+                        </a:ext>
+                      </a:extLst>
+                    </a:blip>
+                    <a:srcRect/>
+                    <a:stretch>
+                      <a:fillRect/>
+                    </a:stretch>
+                  </pic:blipFill>
+                  <pic:spPr bwMode="auto">
+                    <a:xfrm>
+                      <a:off x="0" y="0"/>
+                      <a:ext cx="2750820" cy="1607820"/>
+                    </a:xfrm>
+                    <a:prstGeom prst="rect">
+                      <a:avLst/>
+                    </a:prstGeom>
+                    <a:noFill/>
+                    <a:ln>
+                      <a:noFill/>
+                    </a:ln>
+                  </pic:spPr>
+                </pic:pic>
+              </a:graphicData>
+            </a:graphic>
+          </wp:inline>
+        </w:drawing>
+      </w:r>
+    </w:p>
+    <w:p>
+      <w:pPr>
+        <w:spacing w:after="0"/>
+        <w:jc w:val="center"/>
+        <w:rPr>
+          <w:rFonts w:ascii="Times New Roman" w:hAnsi="Times New Roman" w:cs="Times New Roman"/>
+          <w:sz w:val="28"/>
+          <w:szCs w:val="28"/>
+          <w:lang w:val="en-US"/>
+        </w:rPr>
+      </w:pPr>
+    </w:p>
+    <w:p>
+      <w:pPr>
+        <w:spacing w:after="0"/>
+        <w:jc w:val="center"/>
+        <w:rPr>
+          <w:rFonts w:ascii="Times New Roman" w:hAnsi="Times New Roman" w:cs="Times New Roman"/>
+          <w:noProof/>
+          <w:sz w:val="28"/>
+          <w:szCs w:val="28"/>
+        </w:rPr>
+      </w:pPr>
+      <w:r>
+        <w:rPr>
+          <w:rFonts w:ascii="Times New Roman" w:hAnsi="Times New Roman" w:cs="Times New Roman"/>
+          <w:noProof/>
+          <w:sz w:val="28"/>
+          <w:szCs w:val="28"/>
+        </w:rPr>
+        <w:t xml:space="preserve">Рисунок </w:t>
+      </w:r>
+      <w:r>
+        <w:rPr>
+          <w:rFonts w:ascii="Times New Roman" w:hAnsi="Times New Roman" w:cs="Times New Roman"/>
+          <w:noProof/>
+          <w:sz w:val="28"/>
+          <w:szCs w:val="28"/>
+        </w:rPr>
+        <w:t>11</w:t>
+      </w:r>
+      <w:r>
+        <w:rPr>
+          <w:rFonts w:ascii="Times New Roman" w:hAnsi="Times New Roman" w:cs="Times New Roman"/>
+          <w:noProof/>
+          <w:sz w:val="28"/>
+          <w:szCs w:val="28"/>
+        </w:rPr>
+        <w:t xml:space="preserve"> –</w:t>
+      </w:r>
+      <w:r>
+        <w:rPr>
+          <w:rFonts w:ascii="Times New Roman" w:hAnsi="Times New Roman" w:cs="Times New Roman"/>
+          <w:noProof/>
+          <w:sz w:val="28"/>
+          <w:szCs w:val="28"/>
+        </w:rPr>
+        <w:t xml:space="preserve"> </w:t>
+      </w:r>
+      <w:r>
+        <w:rPr>
+          <w:rFonts w:ascii="Times New Roman" w:hAnsi="Times New Roman" w:cs="Times New Roman"/>
+          <w:noProof/>
+          <w:sz w:val="28"/>
+          <w:szCs w:val="28"/>
+          <w:lang w:val="en-US"/>
+        </w:rPr>
+        <w:t>ICMP</w:t>
+      </w:r>
+      <w:r>
+        <w:rPr>
+          <w:rFonts w:ascii="Times New Roman" w:hAnsi="Times New Roman" w:cs="Times New Roman"/>
+          <w:noProof/>
+          <w:sz w:val="28"/>
+          <w:szCs w:val="28"/>
+        </w:rPr>
+        <w:t xml:space="preserve"> </w:t>
+      </w:r>
+      <w:r>
+        <w:rPr>
+          <w:rFonts w:ascii="Times New Roman" w:hAnsi="Times New Roman" w:cs="Times New Roman"/>
+          <w:noProof/>
+          <w:sz w:val="28"/>
+          <w:szCs w:val="28"/>
+          <w:lang w:val="en-US"/>
+        </w:rPr>
+        <w:t>Echo</w:t>
+      </w:r>
+      <w:r>
+        <w:rPr>
+          <w:rFonts w:ascii="Times New Roman" w:hAnsi="Times New Roman" w:cs="Times New Roman"/>
+          <w:noProof/>
+          <w:sz w:val="28"/>
+          <w:szCs w:val="28"/>
+        </w:rPr>
+        <w:t xml:space="preserve"> </w:t>
+      </w:r>
+      <w:r>
+        <w:rPr>
+          <w:rFonts w:ascii="Times New Roman" w:hAnsi="Times New Roman" w:cs="Times New Roman"/>
+          <w:noProof/>
+          <w:sz w:val="28"/>
+          <w:szCs w:val="28"/>
+          <w:lang w:val="en-US"/>
+        </w:rPr>
+        <w:t>Request</w:t>
+      </w:r>
+      <w:r>
+        <w:rPr>
+          <w:rFonts w:ascii="Times New Roman" w:hAnsi="Times New Roman" w:cs="Times New Roman"/>
+          <w:noProof/>
+          <w:sz w:val="28"/>
+          <w:szCs w:val="28"/>
+        </w:rPr>
+        <w:t xml:space="preserve"> </w:t>
+      </w:r>
+      <w:r>
+        <w:rPr>
+          <w:rFonts w:ascii="Times New Roman" w:hAnsi="Times New Roman" w:cs="Times New Roman"/>
+          <w:noProof/>
+          <w:sz w:val="28"/>
+          <w:szCs w:val="28"/>
+        </w:rPr>
+        <w:t>пакета, дошедшего до промежуточного маршрутизатора (</w:t>
+      </w:r>
+      <w:r>
+        <w:rPr>
+          <w:rFonts w:ascii="Times New Roman" w:hAnsi="Times New Roman" w:cs="Times New Roman"/>
+          <w:noProof/>
+          <w:sz w:val="28"/>
+          <w:szCs w:val="28"/>
+        </w:rPr>
+        <w:t>разработанная</w:t>
+      </w:r>
+      <w:r>
+        <w:rPr>
+          <w:rFonts w:ascii="Times New Roman" w:hAnsi="Times New Roman" w:cs="Times New Roman"/>
+          <w:noProof/>
+          <w:sz w:val="28"/>
+          <w:szCs w:val="28"/>
+        </w:rPr>
+        <w:t xml:space="preserve"> утилита)</w:t>
+      </w:r>
+    </w:p>
+    <w:p>
+      <w:pPr>
+        <w:spacing w:after="0"/>
+        <w:jc w:val="center"/>
+        <w:rPr>
+          <w:rFonts w:ascii="Times New Roman" w:hAnsi="Times New Roman" w:cs="Times New Roman"/>
+          <w:sz w:val="28"/>
+          <w:szCs w:val="28"/>
+        </w:rPr>
+      </w:pPr>
+    </w:p>
+    <w:p>
+      <w:pPr>
+        <w:spacing w:after="0"/>
+        <w:jc w:val="center"/>
+        <w:rPr>
+          <w:rFonts w:ascii="Times New Roman" w:hAnsi="Times New Roman" w:cs="Times New Roman"/>
+          <w:sz w:val="28"/>
+          <w:szCs w:val="28"/>
+        </w:rPr>
+      </w:pPr>
+      <w:r>
+        <w:rPr>
+          <w:rFonts w:ascii="Times New Roman" w:hAnsi="Times New Roman" w:cs="Times New Roman"/>
+          <w:noProof/>
+          <w:sz w:val="28"/>
+          <w:szCs w:val="28"/>
+        </w:rPr>
+        <w:drawing>
+          <wp:inline distT="0" distB="0" distL="0" distR="0" wp14:anchorId="15FF2765" wp14:editId="3223F95E">
+            <wp:extent cx="4579620" cy="4175760"/>
+            <wp:effectExtent l="0" t="0" r="0" b="0"/>
+            <wp:docPr id="10" name="Рисунок 10"/>
+            <wp:cNvGraphicFramePr>
+              <a:graphicFrameLocks xmlns:a="http://schemas.openxmlformats.org/drawingml/2006/main" noChangeAspect="1"/>
+            </wp:cNvGraphicFramePr>
+            <a:graphic xmlns:a="http://schemas.openxmlformats.org/drawingml/2006/main">
+              <a:graphicData uri="http://schemas.openxmlformats.org/drawingml/2006/picture">
+                <pic:pic xmlns:pic="http://schemas.openxmlformats.org/drawingml/2006/picture">
+                  <pic:nvPicPr>
+                    <pic:cNvPr id="0" name="Picture 6"/>
+                    <pic:cNvPicPr>
+                      <a:picLocks noChangeAspect="1" noChangeArrowheads="1"/>
+                    </pic:cNvPicPr>
+                  </pic:nvPicPr>
+                  <pic:blipFill>
+                    <a:blip r:embed="rId19">
+                      <a:extLst>
+                        <a:ext uri="{28A0092B-C50C-407E-A947-70E740481C1C}">
+                          <a14:useLocalDpi xmlns:a14="http://schemas.microsoft.com/office/drawing/2010/main" val="0"/>
+                        </a:ext>
+                      </a:extLst>
+                    </a:blip>
+                    <a:srcRect/>
+                    <a:stretch>
+                      <a:fillRect/>
+                    </a:stretch>
+                  </pic:blipFill>
+                  <pic:spPr bwMode="auto">
+                    <a:xfrm>
+                      <a:off x="0" y="0"/>
+                      <a:ext cx="4579620" cy="4175760"/>
+                    </a:xfrm>
+                    <a:prstGeom prst="rect">
+                      <a:avLst/>
+                    </a:prstGeom>
+                    <a:noFill/>
+                    <a:ln>
+                      <a:noFill/>
+                    </a:ln>
+                  </pic:spPr>
+                </pic:pic>
+              </a:graphicData>
+            </a:graphic>
+          </wp:inline>
+        </w:drawing>
+      </w:r>
+    </w:p>
+    <w:p>
+      <w:pPr>
+        <w:spacing w:after="0"/>
+        <w:jc w:val="center"/>
+        <w:rPr>
+          <w:rFonts w:ascii="Times New Roman" w:hAnsi="Times New Roman" w:cs="Times New Roman"/>
+          <w:sz w:val="28"/>
+          <w:szCs w:val="28"/>
+        </w:rPr>
+      </w:pPr>
+    </w:p>
+    <w:p>
+      <w:pPr>
+        <w:spacing w:after="0"/>
+        <w:jc w:val="center"/>
+        <w:rPr>
+          <w:rFonts w:ascii="Times New Roman" w:hAnsi="Times New Roman" w:cs="Times New Roman"/>
+          <w:sz w:val="28"/>
+          <w:szCs w:val="28"/>
+        </w:rPr>
+      </w:pPr>
+      <w:r>
+        <w:rPr>
+          <w:rFonts w:ascii="Times New Roman" w:hAnsi="Times New Roman" w:cs="Times New Roman"/>
+          <w:noProof/>
+          <w:sz w:val="28"/>
+          <w:szCs w:val="28"/>
+        </w:rPr>
+        <w:t>Рисунок</w:t>
+      </w:r>
+      <w:r>
+        <w:rPr>
+          <w:rFonts w:ascii="Times New Roman" w:hAnsi="Times New Roman" w:cs="Times New Roman"/>
+          <w:noProof/>
+          <w:sz w:val="28"/>
+          <w:szCs w:val="28"/>
+        </w:rPr>
+        <w:t xml:space="preserve"> </w:t>
+      </w:r>
+      <w:r>
+        <w:rPr>
+          <w:rFonts w:ascii="Times New Roman" w:hAnsi="Times New Roman" w:cs="Times New Roman"/>
+          <w:noProof/>
+          <w:sz w:val="28"/>
+          <w:szCs w:val="28"/>
+        </w:rPr>
+        <w:t>1</w:t>
+      </w:r>
+      <w:r>
+        <w:rPr>
+          <w:rFonts w:ascii="Times New Roman" w:hAnsi="Times New Roman" w:cs="Times New Roman"/>
+          <w:noProof/>
+          <w:sz w:val="28"/>
+          <w:szCs w:val="28"/>
+        </w:rPr>
+        <w:t xml:space="preserve">2 </w:t>
+      </w:r>
+      <w:r>
+        <w:rPr>
+          <w:rFonts w:ascii="Times New Roman" w:hAnsi="Times New Roman" w:cs="Times New Roman"/>
+          <w:noProof/>
+          <w:sz w:val="28"/>
+          <w:szCs w:val="28"/>
+        </w:rPr>
+        <w:t>–</w:t>
+      </w:r>
+      <w:r>
+        <w:rPr>
+          <w:rFonts w:ascii="Times New Roman" w:hAnsi="Times New Roman" w:cs="Times New Roman"/>
+          <w:noProof/>
+          <w:sz w:val="28"/>
+          <w:szCs w:val="28"/>
+        </w:rPr>
         <w:t xml:space="preserve"> структура</w:t>
       </w:r>
       <w:r>
@@ -2885,6 +3308,7 @@
           <w:szCs w:val="28"/>
           <w:lang w:val="en-US"/>
         </w:rPr>
+        <w:lastRenderedPageBreak/>
         <w:drawing>
           <wp:inline distT="0" distB="0" distL="0" distR="0" wp14:anchorId="31AB169C" wp14:editId="33A7F7CD">
             <wp:extent cx="3733800" cy="3307080"/>
@@ -2903,7 +3327,7 @@
                     </pic:cNvPicPr>
                   </pic:nvPicPr>
                   <pic:blipFill>
-                    <a:blip r:embed="rId18">
+                    <a:blip r:embed="rId20">
                       <a:extLst>
                         <a:ext uri="{28A0092B-C50C-407E-A947-70E740481C1C}">
                           <a14:useLocalDpi xmlns:a14="http://schemas.microsoft.com/office/drawing/2010/main" val="0"/>
@@ -2982,7 +3406,15 @@
           <w:sz w:val="28"/>
           <w:szCs w:val="28"/>
         </w:rPr>
-        <w:t>11</w:t>
+        <w:t>1</w:t>
+      </w:r>
+      <w:r>
+        <w:rPr>
+          <w:rFonts w:ascii="Times New Roman" w:hAnsi="Times New Roman" w:cs="Times New Roman"/>
+          <w:sz w:val="28"/>
+          <w:szCs w:val="28"/>
+        </w:rPr>
+        <w:t>3</w:t>
       </w:r>
       <w:r>
         <w:rPr>
@@ -3073,7 +3505,6 @@
           <w:szCs w:val="28"/>
           <w:lang w:val="en-US"/>
         </w:rPr>
-        <w:lastRenderedPageBreak/>
         <w:drawing>
           <wp:inline distT="0" distB="0" distL="0" distR="0" wp14:anchorId="1875AB1C" wp14:editId="5E45EFE8">
             <wp:extent cx="4968240" cy="2962384"/>
@@ -3092,7 +3523,7 @@
                     </pic:cNvPicPr>
                   </pic:nvPicPr>
                   <pic:blipFill>
-                    <a:blip r:embed="rId19">
+                    <a:blip r:embed="rId21">
                       <a:extLst>
                         <a:ext uri="{28A0092B-C50C-407E-A947-70E740481C1C}">
                           <a14:useLocalDpi xmlns:a14="http://schemas.microsoft.com/office/drawing/2010/main" val="0"/>
@@ -3168,7 +3599,7 @@
           <w:sz w:val="28"/>
           <w:szCs w:val="28"/>
         </w:rPr>
-        <w:t>2</w:t>
+        <w:t>4</w:t>
       </w:r>
       <w:r>
         <w:rPr>
@@ -3207,7 +3638,7 @@
       </w:r>
     </w:p>
     <w:sectPr>
-      <w:footerReference w:type="default" r:id="rId20"/>
+      <w:footerReference w:type="default" r:id="rId22"/>
       <w:pgSz w:w="11906" w:h="16838"/>
       <w:pgMar w:top="1134" w:right="850" w:bottom="1134" w:left="1701" w:header="708" w:footer="708" w:gutter="0"/>
       <w:cols w:space="708"/>

</xml_diff>

<commit_message>
big and little indian bug fixed fully
</commit_message>
<xml_diff>
--- a/MyTracert/LR2_jalilova.docx
+++ b/MyTracert/LR2_jalilova.docx
@@ -1005,15 +1005,15 @@
           <w:sz w:val="28"/>
           <w:szCs w:val="28"/>
         </w:rPr>
-        <w:t>Выполнение задания представлено на рисунках 1, 2, 3, 4, 5, 6, 7</w:t>
-      </w:r>
-      <w:r>
-        <w:rPr>
-          <w:rFonts w:ascii="Times New Roman" w:hAnsi="Times New Roman" w:cs="Times New Roman"/>
-          <w:sz w:val="28"/>
-          <w:szCs w:val="28"/>
-        </w:rPr>
-        <w:t>, 8</w:t>
+        <w:t>Выполнение задания представлено на рисунках 1</w:t>
+      </w:r>
+      <w:r>
+        <w:rPr>
+          <w:rFonts w:ascii="Times New Roman" w:hAnsi="Times New Roman" w:cs="Times New Roman"/>
+          <w:sz w:val="28"/>
+          <w:szCs w:val="28"/>
+        </w:rPr>
+        <w:t>, 2, 3, 4, 5, 6, 7, 8, 9, 10, 11, 12, 13, 14</w:t>
       </w:r>
       <w:r>
         <w:rPr>
@@ -1215,7 +1215,6 @@
           <w:sz w:val="28"/>
           <w:szCs w:val="28"/>
         </w:rPr>
-        <w:lastRenderedPageBreak/>
         <w:drawing>
           <wp:inline distT="0" distB="0" distL="0" distR="0" wp14:anchorId="6B0BCDEB" wp14:editId="009F61C4">
             <wp:extent cx="5364480" cy="3169920"/>
@@ -1430,17 +1429,6 @@
     <w:p>
       <w:pPr>
         <w:spacing w:after="0"/>
-        <w:rPr>
-          <w:rFonts w:ascii="Times New Roman" w:hAnsi="Times New Roman" w:cs="Times New Roman"/>
-          <w:noProof/>
-          <w:sz w:val="28"/>
-          <w:szCs w:val="28"/>
-        </w:rPr>
-      </w:pPr>
-    </w:p>
-    <w:p>
-      <w:pPr>
-        <w:spacing w:after="0"/>
         <w:jc w:val="center"/>
         <w:rPr>
           <w:rFonts w:ascii="Times New Roman" w:hAnsi="Times New Roman" w:cs="Times New Roman"/>
@@ -1595,18 +1583,6 @@
         </w:rPr>
         <w:t>Wireshark</w:t>
       </w:r>
-    </w:p>
-    <w:p>
-      <w:pPr>
-        <w:spacing w:after="0"/>
-        <w:jc w:val="center"/>
-        <w:rPr>
-          <w:rFonts w:ascii="Times New Roman" w:hAnsi="Times New Roman" w:cs="Times New Roman"/>
-          <w:noProof/>
-          <w:sz w:val="28"/>
-          <w:szCs w:val="28"/>
-        </w:rPr>
-      </w:pPr>
     </w:p>
     <w:p>
       <w:pPr>

</xml_diff>